<commit_message>
Update BUC and SUC analysis documentation to reflect revised use cases and process flows for production order management
</commit_message>
<xml_diff>
--- a/DOCS/BaoCaoKhoaLuan/BaoCaoKhoaLuan-GMP.docx
+++ b/DOCS/BaoCaoKhoaLuan/BaoCaoKhoaLuan-GMP.docx
@@ -1336,23 +1336,7 @@
           <w:sz w:val="28"/>
           <w:szCs w:val="28"/>
         </w:rPr>
-        <w:t>TP. HỒ CHÍ MINH, tháng</w:t>
-      </w:r>
-      <w:proofErr w:type="gramStart"/>
-      <w:r>
-        <w:rPr>
-          <w:sz w:val="28"/>
-          <w:szCs w:val="28"/>
-        </w:rPr>
-        <w:t>....năm</w:t>
-      </w:r>
-      <w:proofErr w:type="gramEnd"/>
-      <w:r>
-        <w:rPr>
-          <w:sz w:val="28"/>
-          <w:szCs w:val="28"/>
-        </w:rPr>
-        <w:t xml:space="preserve"> 202..</w:t>
+        <w:t>TP. HỒ CHÍ MINH, tháng....năm 202..</w:t>
       </w:r>
       <w:r>
         <w:rPr>
@@ -7503,7 +7487,7 @@
         <w:pStyle w:val="NormalWeb"/>
         <w:numPr>
           <w:ilvl w:val="0"/>
-          <w:numId w:val="10"/>
+          <w:numId w:val="3"/>
         </w:numPr>
         <w:tabs>
           <w:tab w:val="clear" w:pos="720"/>
@@ -7529,7 +7513,7 @@
         <w:pStyle w:val="NormalWeb"/>
         <w:numPr>
           <w:ilvl w:val="0"/>
-          <w:numId w:val="10"/>
+          <w:numId w:val="3"/>
         </w:numPr>
         <w:rPr>
           <w:sz w:val="26"/>
@@ -7551,7 +7535,7 @@
         <w:pStyle w:val="NormalWeb"/>
         <w:numPr>
           <w:ilvl w:val="0"/>
-          <w:numId w:val="10"/>
+          <w:numId w:val="3"/>
         </w:numPr>
         <w:rPr>
           <w:sz w:val="26"/>
@@ -7659,7 +7643,7 @@
         <w:pStyle w:val="NormalWeb"/>
         <w:numPr>
           <w:ilvl w:val="0"/>
-          <w:numId w:val="11"/>
+          <w:numId w:val="4"/>
         </w:numPr>
         <w:rPr>
           <w:sz w:val="26"/>
@@ -7793,7 +7777,7 @@
         <w:pStyle w:val="NormalWeb"/>
         <w:numPr>
           <w:ilvl w:val="0"/>
-          <w:numId w:val="11"/>
+          <w:numId w:val="4"/>
         </w:numPr>
         <w:rPr>
           <w:sz w:val="26"/>
@@ -7867,7 +7851,7 @@
         <w:pStyle w:val="NormalWeb"/>
         <w:numPr>
           <w:ilvl w:val="0"/>
-          <w:numId w:val="11"/>
+          <w:numId w:val="4"/>
         </w:numPr>
         <w:rPr>
           <w:sz w:val="26"/>
@@ -7889,7 +7873,7 @@
         <w:pStyle w:val="NormalWeb"/>
         <w:numPr>
           <w:ilvl w:val="0"/>
-          <w:numId w:val="11"/>
+          <w:numId w:val="4"/>
         </w:numPr>
         <w:rPr>
           <w:sz w:val="26"/>
@@ -8219,7 +8203,7 @@
         <w:pStyle w:val="NormalWeb"/>
         <w:numPr>
           <w:ilvl w:val="0"/>
-          <w:numId w:val="9"/>
+          <w:numId w:val="2"/>
         </w:numPr>
         <w:rPr>
           <w:sz w:val="26"/>
@@ -8241,7 +8225,7 @@
         <w:pStyle w:val="NormalWeb"/>
         <w:numPr>
           <w:ilvl w:val="0"/>
-          <w:numId w:val="9"/>
+          <w:numId w:val="2"/>
         </w:numPr>
         <w:rPr>
           <w:sz w:val="26"/>
@@ -8263,7 +8247,7 @@
         <w:pStyle w:val="NormalWeb"/>
         <w:numPr>
           <w:ilvl w:val="0"/>
-          <w:numId w:val="9"/>
+          <w:numId w:val="2"/>
         </w:numPr>
         <w:rPr>
           <w:sz w:val="26"/>
@@ -8285,7 +8269,7 @@
         <w:pStyle w:val="NormalWeb"/>
         <w:numPr>
           <w:ilvl w:val="0"/>
-          <w:numId w:val="9"/>
+          <w:numId w:val="2"/>
         </w:numPr>
         <w:rPr>
           <w:sz w:val="26"/>
@@ -8416,6 +8400,9 @@
         <w:jc w:val="center"/>
       </w:pPr>
       <w:r>
+        <w:rPr>
+          <w:noProof/>
+        </w:rPr>
         <w:drawing>
           <wp:inline distT="0" distB="0" distL="0" distR="0" wp14:anchorId="7735E841" wp14:editId="0A6A5EC7">
             <wp:extent cx="5731510" cy="2708910"/>
@@ -8533,17 +8520,8 @@
           <w:szCs w:val="26"/>
           <w:lang w:val="vi-VN"/>
         </w:rPr>
-        <w:t>1. Đặc tả Use-case: Kiểm tra vệ sinh và môi trường</w:t>
-      </w:r>
-    </w:p>
-    <w:p>
-      <w:pPr>
-        <w:rPr>
-          <w:sz w:val="26"/>
-          <w:szCs w:val="26"/>
-          <w:lang w:val="vi-VN"/>
-        </w:rPr>
-      </w:pPr>
+        <w:t xml:space="preserve">1. Đặc tả Use-case: </w:t>
+      </w:r>
       <w:r>
         <w:rPr>
           <w:b/>
@@ -8552,6 +8530,25 @@
           <w:szCs w:val="26"/>
           <w:lang w:val="vi-VN"/>
         </w:rPr>
+        <w:t>Lập Kế hoạch và Ban hành Lệnh Sản Xuất</w:t>
+      </w:r>
+    </w:p>
+    <w:p>
+      <w:pPr>
+        <w:rPr>
+          <w:sz w:val="26"/>
+          <w:szCs w:val="26"/>
+          <w:lang w:val="vi-VN"/>
+        </w:rPr>
+      </w:pPr>
+      <w:r>
+        <w:rPr>
+          <w:b/>
+          <w:bCs/>
+          <w:sz w:val="26"/>
+          <w:szCs w:val="26"/>
+          <w:lang w:val="vi-VN"/>
+        </w:rPr>
         <w:t>Use case nghiệp vụ:</w:t>
       </w:r>
       <w:r>
@@ -8560,31 +8557,6 @@
           <w:szCs w:val="26"/>
           <w:lang w:val="vi-VN"/>
         </w:rPr>
-        <w:t xml:space="preserve"> Kiểm tra điều kiện sản xuất</w:t>
-      </w:r>
-    </w:p>
-    <w:p>
-      <w:pPr>
-        <w:rPr>
-          <w:sz w:val="26"/>
-          <w:szCs w:val="26"/>
-          <w:lang w:val="vi-VN"/>
-        </w:rPr>
-      </w:pPr>
-      <w:r>
-        <w:rPr>
-          <w:sz w:val="26"/>
-          <w:szCs w:val="26"/>
-          <w:lang w:val="vi-VN"/>
-        </w:rPr>
-        <w:t>Use case bắt đầu khi nhân viên sản xuất</w:t>
-      </w:r>
-      <w:r>
-        <w:rPr>
-          <w:sz w:val="26"/>
-          <w:szCs w:val="26"/>
-          <w:lang w:val="vi-VN"/>
-        </w:rPr>
         <w:t xml:space="preserve"> </w:t>
       </w:r>
       <w:r>
@@ -8593,7 +8565,56 @@
           <w:szCs w:val="26"/>
           <w:lang w:val="vi-VN"/>
         </w:rPr>
-        <w:t>đăng nhập hệ thống Mobile và bắt đầu thực hiện một mẻ sản xuất mới. Mục tiêu nhằm đảm bảo môi trường và thiết bị đạt chuẩn GMP trước khi vận hành.</w:t>
+        <w:t>Lập Kế hoạch và Ban hành Lệnh Sản Xuất</w:t>
+      </w:r>
+    </w:p>
+    <w:p>
+      <w:pPr>
+        <w:rPr>
+          <w:sz w:val="26"/>
+          <w:szCs w:val="26"/>
+          <w:lang w:val="vi-VN"/>
+        </w:rPr>
+      </w:pPr>
+      <w:r>
+        <w:rPr>
+          <w:sz w:val="26"/>
+          <w:szCs w:val="26"/>
+          <w:lang w:val="vi-VN"/>
+        </w:rPr>
+        <w:t xml:space="preserve">Use case bắt đầu </w:t>
+      </w:r>
+      <w:r>
+        <w:rPr>
+          <w:sz w:val="26"/>
+          <w:szCs w:val="26"/>
+          <w:lang w:val="vi-VN"/>
+        </w:rPr>
+        <w:t>khi</w:t>
+      </w:r>
+      <w:r>
+        <w:rPr>
+          <w:sz w:val="26"/>
+          <w:szCs w:val="26"/>
+          <w:lang w:val="vi-VN"/>
+        </w:rPr>
+        <w:t xml:space="preserve"> </w:t>
+      </w:r>
+      <w:r>
+        <w:rPr>
+          <w:sz w:val="26"/>
+          <w:szCs w:val="26"/>
+          <w:lang w:val="vi-VN"/>
+        </w:rPr>
+        <w:t>nhân viên quản lý</w:t>
+      </w:r>
+      <w:r>
+        <w:rPr>
+          <w:sz w:val="26"/>
+          <w:szCs w:val="26"/>
+          <w:lang w:val="vi-VN"/>
+        </w:rPr>
+        <w:t xml:space="preserve"> tiếp nhận yêu cầu sản xuất và bắt đầu thiết lập thông tin để ban hành Lệnh sản xuất xuống xưởng. Mục tiêu nhằm đảm bảo số lượng, công thức, định mức vật tư và Quy trình công đoạn (Routing) sản xuất rõ ràng.</w:t>
       </w:r>
     </w:p>
     <w:p>
@@ -8622,7 +8643,7 @@
         <w:pStyle w:val="ListParagraph"/>
         <w:numPr>
           <w:ilvl w:val="0"/>
-          <w:numId w:val="41"/>
+          <w:numId w:val="33"/>
         </w:numPr>
         <w:rPr>
           <w:sz w:val="26"/>
@@ -8636,23 +8657,15 @@
           <w:szCs w:val="26"/>
           <w:lang w:val="vi-VN"/>
         </w:rPr>
-        <w:t>Nhân viên</w:t>
-      </w:r>
-      <w:r>
-        <w:rPr>
-          <w:sz w:val="26"/>
-          <w:szCs w:val="26"/>
-          <w:lang w:val="vi-VN"/>
-        </w:rPr>
-        <w:t xml:space="preserve"> sản xuất kiểm tra điều kiện vệ sinh và môi trường</w:t>
-      </w:r>
-      <w:r>
-        <w:rPr>
-          <w:sz w:val="26"/>
-          <w:szCs w:val="26"/>
-          <w:lang w:val="vi-VN"/>
-        </w:rPr>
-        <w:t>.</w:t>
+        <w:t>Nhân viên quản lý</w:t>
+      </w:r>
+      <w:r>
+        <w:rPr>
+          <w:sz w:val="26"/>
+          <w:szCs w:val="26"/>
+          <w:lang w:val="vi-VN"/>
+        </w:rPr>
+        <w:t xml:space="preserve"> đăng nhập vào hệ thống quản lý.</w:t>
       </w:r>
     </w:p>
     <w:p>
@@ -8660,7 +8673,7 @@
         <w:pStyle w:val="ListParagraph"/>
         <w:numPr>
           <w:ilvl w:val="0"/>
-          <w:numId w:val="41"/>
+          <w:numId w:val="33"/>
         </w:numPr>
         <w:rPr>
           <w:sz w:val="26"/>
@@ -8674,23 +8687,7 @@
           <w:szCs w:val="26"/>
           <w:lang w:val="vi-VN"/>
         </w:rPr>
-        <w:t>Hệ thống hiển thị biểu mẫu kiểm tra điều kiện</w:t>
-      </w:r>
-      <w:r>
-        <w:rPr>
-          <w:sz w:val="26"/>
-          <w:szCs w:val="26"/>
-          <w:lang w:val="vi-VN"/>
-        </w:rPr>
-        <w:t xml:space="preserve"> vệ sinh và môi trường</w:t>
-      </w:r>
-      <w:r>
-        <w:rPr>
-          <w:sz w:val="26"/>
-          <w:szCs w:val="26"/>
-          <w:lang w:val="vi-VN"/>
-        </w:rPr>
-        <w:t>.</w:t>
+        <w:t>Hệ thống hiển thị danh sách công thức sản xuất hiện có.</w:t>
       </w:r>
     </w:p>
     <w:p>
@@ -8698,7 +8695,7 @@
         <w:pStyle w:val="ListParagraph"/>
         <w:numPr>
           <w:ilvl w:val="0"/>
-          <w:numId w:val="41"/>
+          <w:numId w:val="33"/>
         </w:numPr>
         <w:rPr>
           <w:sz w:val="26"/>
@@ -8712,23 +8709,15 @@
           <w:szCs w:val="26"/>
           <w:lang w:val="vi-VN"/>
         </w:rPr>
-        <w:t>Nhân viên</w:t>
-      </w:r>
-      <w:r>
-        <w:rPr>
-          <w:sz w:val="26"/>
-          <w:szCs w:val="26"/>
-          <w:lang w:val="vi-VN"/>
-        </w:rPr>
-        <w:t xml:space="preserve"> sản xuất</w:t>
-      </w:r>
-      <w:r>
-        <w:rPr>
-          <w:sz w:val="26"/>
-          <w:szCs w:val="26"/>
-          <w:lang w:val="vi-VN"/>
-        </w:rPr>
-        <w:t xml:space="preserve"> ghi nhận trạng thái vệ sinh (Phòng cân, Máy móc, Dụng cụ) là "Sạch".</w:t>
+        <w:t>Nhân viên quản lý</w:t>
+      </w:r>
+      <w:r>
+        <w:rPr>
+          <w:sz w:val="26"/>
+          <w:szCs w:val="26"/>
+          <w:lang w:val="vi-VN"/>
+        </w:rPr>
+        <w:t xml:space="preserve"> lựa chọn công thức, thiết lập cỡ lô và số lượng mẻ cần sản xuất.</w:t>
       </w:r>
     </w:p>
     <w:p>
@@ -8736,7 +8725,7 @@
         <w:pStyle w:val="ListParagraph"/>
         <w:numPr>
           <w:ilvl w:val="0"/>
-          <w:numId w:val="41"/>
+          <w:numId w:val="33"/>
         </w:numPr>
         <w:rPr>
           <w:sz w:val="26"/>
@@ -8750,23 +8739,23 @@
           <w:szCs w:val="26"/>
           <w:lang w:val="vi-VN"/>
         </w:rPr>
-        <w:t>Nhân viên</w:t>
-      </w:r>
-      <w:r>
-        <w:rPr>
-          <w:sz w:val="26"/>
-          <w:szCs w:val="26"/>
-          <w:lang w:val="vi-VN"/>
-        </w:rPr>
-        <w:t xml:space="preserve"> sản xuất</w:t>
-      </w:r>
-      <w:r>
-        <w:rPr>
-          <w:sz w:val="26"/>
-          <w:szCs w:val="26"/>
-          <w:lang w:val="vi-VN"/>
-        </w:rPr>
-        <w:t xml:space="preserve"> nhập các thông số môi trường thực tế: Nhiệt độ (21°C – 25°C), Độ ẩm (45% – 70%), Áp suất (≥ 10 Pa).</w:t>
+        <w:t>Hệ thống tự động tính BOM</w:t>
+      </w:r>
+      <w:r>
+        <w:rPr>
+          <w:sz w:val="26"/>
+          <w:szCs w:val="26"/>
+          <w:lang w:val="vi-VN"/>
+        </w:rPr>
+        <w:t xml:space="preserve"> </w:t>
+      </w:r>
+      <w:r>
+        <w:rPr>
+          <w:sz w:val="26"/>
+          <w:szCs w:val="26"/>
+          <w:lang w:val="vi-VN"/>
+        </w:rPr>
+        <w:t>cần thiết cho lệnh.</w:t>
       </w:r>
     </w:p>
     <w:p>
@@ -8774,7 +8763,7 @@
         <w:pStyle w:val="ListParagraph"/>
         <w:numPr>
           <w:ilvl w:val="0"/>
-          <w:numId w:val="41"/>
+          <w:numId w:val="33"/>
         </w:numPr>
         <w:rPr>
           <w:sz w:val="26"/>
@@ -8788,23 +8777,15 @@
           <w:szCs w:val="26"/>
           <w:lang w:val="vi-VN"/>
         </w:rPr>
-        <w:t>Hệ thống kiểm tra các chỉ số so với định mức kỹ thuật</w:t>
-      </w:r>
-      <w:r>
-        <w:rPr>
-          <w:sz w:val="26"/>
-          <w:szCs w:val="26"/>
-          <w:lang w:val="vi-VN"/>
-        </w:rPr>
-        <w:t xml:space="preserve"> </w:t>
-      </w:r>
-      <w:r>
-        <w:rPr>
-          <w:sz w:val="26"/>
-          <w:szCs w:val="26"/>
-          <w:lang w:val="vi-VN"/>
-        </w:rPr>
-        <w:t>đã thiết lập trong công thức.</w:t>
+        <w:t>Nhân viên quản lý</w:t>
+      </w:r>
+      <w:r>
+        <w:rPr>
+          <w:sz w:val="26"/>
+          <w:szCs w:val="26"/>
+          <w:lang w:val="vi-VN"/>
+        </w:rPr>
+        <w:t xml:space="preserve"> xác nhận và ban hành Lệnh sản xuất theo đúng Quy trình Routing.</w:t>
       </w:r>
     </w:p>
     <w:p>
@@ -8812,7 +8793,7 @@
         <w:pStyle w:val="ListParagraph"/>
         <w:numPr>
           <w:ilvl w:val="0"/>
-          <w:numId w:val="41"/>
+          <w:numId w:val="33"/>
         </w:numPr>
         <w:rPr>
           <w:sz w:val="26"/>
@@ -8826,7 +8807,60 @@
           <w:szCs w:val="26"/>
           <w:lang w:val="vi-VN"/>
         </w:rPr>
-        <w:t>Nhân viên nhập PIN để ký tên điện tử xác nhận.</w:t>
+        <w:t xml:space="preserve">Hệ thống lưu trạng thái lệnh và tự động chuyển thông báo đến </w:t>
+      </w:r>
+      <w:r>
+        <w:rPr>
+          <w:sz w:val="26"/>
+          <w:szCs w:val="26"/>
+          <w:lang w:val="vi-VN"/>
+        </w:rPr>
+        <w:t>nhân viên</w:t>
+      </w:r>
+      <w:r>
+        <w:rPr>
+          <w:sz w:val="26"/>
+          <w:szCs w:val="26"/>
+          <w:lang w:val="vi-VN"/>
+        </w:rPr>
+        <w:t xml:space="preserve"> </w:t>
+      </w:r>
+      <w:r>
+        <w:rPr>
+          <w:sz w:val="26"/>
+          <w:szCs w:val="26"/>
+          <w:lang w:val="vi-VN"/>
+        </w:rPr>
+        <w:t>k</w:t>
+      </w:r>
+      <w:r>
+        <w:rPr>
+          <w:sz w:val="26"/>
+          <w:szCs w:val="26"/>
+          <w:lang w:val="vi-VN"/>
+        </w:rPr>
+        <w:t>ho.</w:t>
+      </w:r>
+    </w:p>
+    <w:p>
+      <w:pPr>
+        <w:rPr>
+          <w:b/>
+          <w:bCs/>
+          <w:sz w:val="26"/>
+          <w:szCs w:val="26"/>
+          <w:lang w:val="vi-VN"/>
+        </w:rPr>
+      </w:pPr>
+      <w:r>
+        <w:rPr>
+          <w:b/>
+          <w:bCs/>
+          <w:sz w:val="26"/>
+          <w:szCs w:val="26"/>
+          <w:lang w:val="vi-VN"/>
+        </w:rPr>
+        <w:t>Các dòng thay thế:</w:t>
       </w:r>
     </w:p>
     <w:p>
@@ -8834,7 +8868,7 @@
         <w:pStyle w:val="ListParagraph"/>
         <w:numPr>
           <w:ilvl w:val="0"/>
-          <w:numId w:val="41"/>
+          <w:numId w:val="23"/>
         </w:numPr>
         <w:rPr>
           <w:sz w:val="26"/>
@@ -8848,28 +8882,7 @@
           <w:szCs w:val="26"/>
           <w:lang w:val="vi-VN"/>
         </w:rPr>
-        <w:t>Hệ thống lưu kết quả kiểm tra và cho phép bắt đầu công đoạn sản xuất.</w:t>
-      </w:r>
-    </w:p>
-    <w:p>
-      <w:pPr>
-        <w:rPr>
-          <w:b/>
-          <w:bCs/>
-          <w:sz w:val="26"/>
-          <w:szCs w:val="26"/>
-          <w:lang w:val="vi-VN"/>
-        </w:rPr>
-      </w:pPr>
-      <w:r>
-        <w:rPr>
-          <w:b/>
-          <w:bCs/>
-          <w:sz w:val="26"/>
-          <w:szCs w:val="26"/>
-          <w:lang w:val="vi-VN"/>
-        </w:rPr>
-        <w:t>Các dòng thay thế:</w:t>
+        <w:t>Tại bước 5: Nếu thông số môi trường hoặc vệ sinh không đạt (ngoài khoảng cho phép), hệ thống hiển thị cảnh báo đỏ và yêu cầu xử lý/ghi chú lý do hoặc không cho phép chuyển bước (tùy cấu hình nghiêm ngặt).</w:t>
       </w:r>
     </w:p>
     <w:p>
@@ -8877,7 +8890,7 @@
         <w:pStyle w:val="ListParagraph"/>
         <w:numPr>
           <w:ilvl w:val="0"/>
-          <w:numId w:val="40"/>
+          <w:numId w:val="23"/>
         </w:numPr>
         <w:rPr>
           <w:sz w:val="26"/>
@@ -8891,28 +8904,6 @@
           <w:szCs w:val="26"/>
           <w:lang w:val="vi-VN"/>
         </w:rPr>
-        <w:t>Tại bước 5: Nếu thông số môi trường hoặc vệ sinh không đạt (ngoài khoảng cho phép), hệ thống hiển thị cảnh báo đỏ và yêu cầu xử lý/ghi chú lý do hoặc không cho phép chuyển bước (tùy cấu hình nghiêm ngặt).</w:t>
-      </w:r>
-    </w:p>
-    <w:p>
-      <w:pPr>
-        <w:pStyle w:val="ListParagraph"/>
-        <w:numPr>
-          <w:ilvl w:val="0"/>
-          <w:numId w:val="40"/>
-        </w:numPr>
-        <w:rPr>
-          <w:sz w:val="26"/>
-          <w:szCs w:val="26"/>
-          <w:lang w:val="vi-VN"/>
-        </w:rPr>
-      </w:pPr>
-      <w:r>
-        <w:rPr>
-          <w:sz w:val="26"/>
-          <w:szCs w:val="26"/>
-          <w:lang w:val="vi-VN"/>
-        </w:rPr>
         <w:t>Tại bước 6: Nếu PIN không chính xác, hệ thống từ chối ghi nhận chữ ký và yêu cầu nhập lại.</w:t>
       </w:r>
     </w:p>
@@ -8936,11 +8927,11 @@
       </w:pPr>
       <w:r>
         <w:rPr>
-          <w:sz w:val="26"/>
-          <w:szCs w:val="26"/>
-          <w:lang w:val="vi-VN"/>
-        </w:rPr>
-        <w:lastRenderedPageBreak/>
+          <w:noProof/>
+          <w:sz w:val="26"/>
+          <w:szCs w:val="26"/>
+          <w:lang w:val="vi-VN"/>
+        </w:rPr>
         <w:drawing>
           <wp:inline distT="0" distB="0" distL="0" distR="0" wp14:anchorId="576C4EBD" wp14:editId="71158CB0">
             <wp:extent cx="4239217" cy="4505954"/>
@@ -9094,7 +9085,7 @@
         <w:pStyle w:val="ListParagraph"/>
         <w:numPr>
           <w:ilvl w:val="0"/>
-          <w:numId w:val="39"/>
+          <w:numId w:val="22"/>
         </w:numPr>
         <w:rPr>
           <w:sz w:val="26"/>
@@ -9156,7 +9147,7 @@
         <w:pStyle w:val="ListParagraph"/>
         <w:numPr>
           <w:ilvl w:val="0"/>
-          <w:numId w:val="39"/>
+          <w:numId w:val="22"/>
         </w:numPr>
         <w:rPr>
           <w:sz w:val="26"/>
@@ -9218,7 +9209,7 @@
         <w:pStyle w:val="ListParagraph"/>
         <w:numPr>
           <w:ilvl w:val="0"/>
-          <w:numId w:val="39"/>
+          <w:numId w:val="22"/>
         </w:numPr>
         <w:rPr>
           <w:sz w:val="26"/>
@@ -9256,7 +9247,7 @@
         <w:pStyle w:val="ListParagraph"/>
         <w:numPr>
           <w:ilvl w:val="0"/>
-          <w:numId w:val="39"/>
+          <w:numId w:val="22"/>
         </w:numPr>
         <w:rPr>
           <w:sz w:val="26"/>
@@ -9286,7 +9277,7 @@
         <w:pStyle w:val="ListParagraph"/>
         <w:numPr>
           <w:ilvl w:val="0"/>
-          <w:numId w:val="39"/>
+          <w:numId w:val="22"/>
         </w:numPr>
         <w:rPr>
           <w:sz w:val="26"/>
@@ -9332,7 +9323,7 @@
         <w:pStyle w:val="ListParagraph"/>
         <w:numPr>
           <w:ilvl w:val="0"/>
-          <w:numId w:val="39"/>
+          <w:numId w:val="22"/>
         </w:numPr>
         <w:rPr>
           <w:sz w:val="26"/>
@@ -9370,7 +9361,7 @@
         <w:pStyle w:val="ListParagraph"/>
         <w:numPr>
           <w:ilvl w:val="0"/>
-          <w:numId w:val="39"/>
+          <w:numId w:val="22"/>
         </w:numPr>
         <w:rPr>
           <w:sz w:val="26"/>
@@ -9392,7 +9383,7 @@
         <w:pStyle w:val="ListParagraph"/>
         <w:numPr>
           <w:ilvl w:val="0"/>
-          <w:numId w:val="39"/>
+          <w:numId w:val="22"/>
         </w:numPr>
         <w:rPr>
           <w:sz w:val="26"/>
@@ -9435,7 +9426,7 @@
         <w:pStyle w:val="ListParagraph"/>
         <w:numPr>
           <w:ilvl w:val="0"/>
-          <w:numId w:val="38"/>
+          <w:numId w:val="21"/>
         </w:numPr>
         <w:rPr>
           <w:sz w:val="26"/>
@@ -9457,7 +9448,7 @@
         <w:pStyle w:val="ListParagraph"/>
         <w:numPr>
           <w:ilvl w:val="0"/>
-          <w:numId w:val="38"/>
+          <w:numId w:val="21"/>
         </w:numPr>
         <w:rPr>
           <w:sz w:val="26"/>
@@ -9471,7 +9462,6 @@
           <w:szCs w:val="26"/>
           <w:lang w:val="vi-VN"/>
         </w:rPr>
-        <w:lastRenderedPageBreak/>
         <w:t xml:space="preserve">Tại bước </w:t>
       </w:r>
       <w:r>
@@ -9502,6 +9492,7 @@
       </w:pPr>
       <w:r>
         <w:rPr>
+          <w:noProof/>
           <w:sz w:val="26"/>
           <w:szCs w:val="26"/>
           <w:lang w:val="vi-VN"/>
@@ -9634,7 +9625,7 @@
         <w:pStyle w:val="ListParagraph"/>
         <w:numPr>
           <w:ilvl w:val="0"/>
-          <w:numId w:val="37"/>
+          <w:numId w:val="20"/>
         </w:numPr>
         <w:rPr>
           <w:sz w:val="26"/>
@@ -9704,7 +9695,7 @@
         <w:pStyle w:val="ListParagraph"/>
         <w:numPr>
           <w:ilvl w:val="0"/>
-          <w:numId w:val="37"/>
+          <w:numId w:val="20"/>
         </w:numPr>
         <w:rPr>
           <w:sz w:val="26"/>
@@ -9718,6 +9709,7 @@
           <w:szCs w:val="26"/>
           <w:lang w:val="vi-VN"/>
         </w:rPr>
+        <w:lastRenderedPageBreak/>
         <w:t>Hệ thống hiển thị danh sách nguyên liệu và khối lượng định mức cần cân (lấy từ BOM của lệnh).</w:t>
       </w:r>
     </w:p>
@@ -9726,7 +9718,7 @@
         <w:pStyle w:val="ListParagraph"/>
         <w:numPr>
           <w:ilvl w:val="0"/>
-          <w:numId w:val="37"/>
+          <w:numId w:val="20"/>
         </w:numPr>
         <w:rPr>
           <w:sz w:val="26"/>
@@ -9748,7 +9740,7 @@
         <w:pStyle w:val="ListParagraph"/>
         <w:numPr>
           <w:ilvl w:val="0"/>
-          <w:numId w:val="37"/>
+          <w:numId w:val="20"/>
         </w:numPr>
         <w:rPr>
           <w:sz w:val="26"/>
@@ -9770,7 +9762,7 @@
         <w:pStyle w:val="ListParagraph"/>
         <w:numPr>
           <w:ilvl w:val="0"/>
-          <w:numId w:val="37"/>
+          <w:numId w:val="20"/>
         </w:numPr>
         <w:rPr>
           <w:sz w:val="26"/>
@@ -9800,7 +9792,7 @@
         <w:pStyle w:val="ListParagraph"/>
         <w:numPr>
           <w:ilvl w:val="0"/>
-          <w:numId w:val="37"/>
+          <w:numId w:val="20"/>
         </w:numPr>
         <w:rPr>
           <w:sz w:val="26"/>
@@ -9830,7 +9822,7 @@
         <w:pStyle w:val="ListParagraph"/>
         <w:numPr>
           <w:ilvl w:val="0"/>
-          <w:numId w:val="37"/>
+          <w:numId w:val="20"/>
         </w:numPr>
         <w:rPr>
           <w:sz w:val="26"/>
@@ -9881,7 +9873,7 @@
         <w:pStyle w:val="ListParagraph"/>
         <w:numPr>
           <w:ilvl w:val="0"/>
-          <w:numId w:val="36"/>
+          <w:numId w:val="19"/>
         </w:numPr>
         <w:rPr>
           <w:sz w:val="26"/>
@@ -9909,11 +9901,11 @@
       </w:pPr>
       <w:r>
         <w:rPr>
-          <w:sz w:val="26"/>
-          <w:szCs w:val="26"/>
-          <w:lang w:val="vi-VN"/>
-        </w:rPr>
-        <w:lastRenderedPageBreak/>
+          <w:noProof/>
+          <w:sz w:val="26"/>
+          <w:szCs w:val="26"/>
+          <w:lang w:val="vi-VN"/>
+        </w:rPr>
         <w:drawing>
           <wp:inline distT="0" distB="0" distL="0" distR="0" wp14:anchorId="73672777" wp14:editId="5761FC76">
             <wp:extent cx="3858163" cy="3982006"/>
@@ -10042,7 +10034,7 @@
         <w:pStyle w:val="ListParagraph"/>
         <w:numPr>
           <w:ilvl w:val="0"/>
-          <w:numId w:val="35"/>
+          <w:numId w:val="18"/>
         </w:numPr>
         <w:rPr>
           <w:sz w:val="26"/>
@@ -10112,7 +10104,7 @@
         <w:pStyle w:val="ListParagraph"/>
         <w:numPr>
           <w:ilvl w:val="0"/>
-          <w:numId w:val="35"/>
+          <w:numId w:val="18"/>
         </w:numPr>
         <w:rPr>
           <w:sz w:val="26"/>
@@ -10134,7 +10126,7 @@
         <w:pStyle w:val="ListParagraph"/>
         <w:numPr>
           <w:ilvl w:val="0"/>
-          <w:numId w:val="35"/>
+          <w:numId w:val="18"/>
         </w:numPr>
         <w:rPr>
           <w:sz w:val="26"/>
@@ -10172,7 +10164,7 @@
         <w:pStyle w:val="ListParagraph"/>
         <w:numPr>
           <w:ilvl w:val="0"/>
-          <w:numId w:val="37"/>
+          <w:numId w:val="20"/>
         </w:numPr>
         <w:rPr>
           <w:sz w:val="26"/>
@@ -10218,7 +10210,7 @@
         <w:pStyle w:val="ListParagraph"/>
         <w:numPr>
           <w:ilvl w:val="0"/>
-          <w:numId w:val="35"/>
+          <w:numId w:val="18"/>
         </w:numPr>
         <w:rPr>
           <w:sz w:val="26"/>
@@ -10261,7 +10253,7 @@
         <w:pStyle w:val="ListParagraph"/>
         <w:numPr>
           <w:ilvl w:val="0"/>
-          <w:numId w:val="34"/>
+          <w:numId w:val="17"/>
         </w:numPr>
         <w:rPr>
           <w:lang w:val="vi-VN"/>
@@ -10273,6 +10265,7 @@
           <w:szCs w:val="26"/>
           <w:lang w:val="vi-VN"/>
         </w:rPr>
+        <w:lastRenderedPageBreak/>
         <w:t xml:space="preserve">Tại bước </w:t>
       </w:r>
       <w:r>
@@ -10301,9 +10294,9 @@
       </w:pPr>
       <w:r>
         <w:rPr>
-          <w:lang w:val="vi-VN"/>
-        </w:rPr>
-        <w:lastRenderedPageBreak/>
+          <w:noProof/>
+          <w:lang w:val="vi-VN"/>
+        </w:rPr>
         <w:drawing>
           <wp:inline distT="0" distB="0" distL="0" distR="0" wp14:anchorId="4E9BF1FF" wp14:editId="16F416E0">
             <wp:extent cx="5731510" cy="2759075"/>
@@ -10468,7 +10461,7 @@
         <w:pStyle w:val="ListParagraph"/>
         <w:numPr>
           <w:ilvl w:val="0"/>
-          <w:numId w:val="12"/>
+          <w:numId w:val="5"/>
         </w:numPr>
         <w:rPr>
           <w:lang w:val="vi-VN"/>
@@ -10504,7 +10497,7 @@
         <w:pStyle w:val="ListParagraph"/>
         <w:numPr>
           <w:ilvl w:val="0"/>
-          <w:numId w:val="12"/>
+          <w:numId w:val="5"/>
         </w:numPr>
         <w:rPr>
           <w:lang w:val="vi-VN"/>
@@ -10524,7 +10517,7 @@
         <w:pStyle w:val="ListParagraph"/>
         <w:numPr>
           <w:ilvl w:val="0"/>
-          <w:numId w:val="12"/>
+          <w:numId w:val="5"/>
         </w:numPr>
         <w:rPr>
           <w:lang w:val="vi-VN"/>
@@ -10568,7 +10561,7 @@
         <w:pStyle w:val="ListParagraph"/>
         <w:numPr>
           <w:ilvl w:val="0"/>
-          <w:numId w:val="12"/>
+          <w:numId w:val="5"/>
         </w:numPr>
         <w:rPr>
           <w:lang w:val="vi-VN"/>
@@ -10588,7 +10581,7 @@
         <w:pStyle w:val="ListParagraph"/>
         <w:numPr>
           <w:ilvl w:val="0"/>
-          <w:numId w:val="12"/>
+          <w:numId w:val="5"/>
         </w:numPr>
         <w:rPr>
           <w:lang w:val="vi-VN"/>
@@ -10638,7 +10631,7 @@
         <w:pStyle w:val="ListParagraph"/>
         <w:numPr>
           <w:ilvl w:val="0"/>
-          <w:numId w:val="12"/>
+          <w:numId w:val="5"/>
         </w:numPr>
         <w:rPr>
           <w:lang w:val="vi-VN"/>
@@ -10658,7 +10651,7 @@
         <w:pStyle w:val="ListParagraph"/>
         <w:numPr>
           <w:ilvl w:val="0"/>
-          <w:numId w:val="12"/>
+          <w:numId w:val="5"/>
         </w:numPr>
         <w:rPr>
           <w:lang w:val="vi-VN"/>
@@ -10694,7 +10687,7 @@
         <w:pStyle w:val="ListParagraph"/>
         <w:numPr>
           <w:ilvl w:val="0"/>
-          <w:numId w:val="12"/>
+          <w:numId w:val="5"/>
         </w:numPr>
         <w:rPr>
           <w:lang w:val="vi-VN"/>
@@ -10753,7 +10746,7 @@
         <w:pStyle w:val="ListParagraph"/>
         <w:numPr>
           <w:ilvl w:val="0"/>
-          <w:numId w:val="16"/>
+          <w:numId w:val="8"/>
         </w:numPr>
         <w:rPr>
           <w:lang w:val="vi-VN"/>
@@ -10789,7 +10782,7 @@
         <w:pStyle w:val="ListParagraph"/>
         <w:numPr>
           <w:ilvl w:val="0"/>
-          <w:numId w:val="16"/>
+          <w:numId w:val="8"/>
         </w:numPr>
         <w:rPr>
           <w:lang w:val="vi-VN"/>
@@ -10834,6 +10827,7 @@
       </w:pPr>
       <w:r>
         <w:rPr>
+          <w:noProof/>
           <w:lang w:val="vi-VN"/>
         </w:rPr>
         <w:lastRenderedPageBreak/>
@@ -11007,7 +11001,7 @@
         <w:pStyle w:val="ListParagraph"/>
         <w:numPr>
           <w:ilvl w:val="0"/>
-          <w:numId w:val="14"/>
+          <w:numId w:val="6"/>
         </w:numPr>
         <w:rPr>
           <w:lang w:val="vi-VN"/>
@@ -11027,7 +11021,7 @@
         <w:pStyle w:val="ListParagraph"/>
         <w:numPr>
           <w:ilvl w:val="0"/>
-          <w:numId w:val="14"/>
+          <w:numId w:val="6"/>
         </w:numPr>
         <w:rPr>
           <w:lang w:val="vi-VN"/>
@@ -11047,7 +11041,7 @@
         <w:pStyle w:val="ListParagraph"/>
         <w:numPr>
           <w:ilvl w:val="0"/>
-          <w:numId w:val="14"/>
+          <w:numId w:val="6"/>
         </w:numPr>
         <w:rPr>
           <w:lang w:val="vi-VN"/>
@@ -11067,7 +11061,7 @@
         <w:pStyle w:val="ListParagraph"/>
         <w:numPr>
           <w:ilvl w:val="0"/>
-          <w:numId w:val="14"/>
+          <w:numId w:val="6"/>
         </w:numPr>
         <w:rPr>
           <w:lang w:val="vi-VN"/>
@@ -11087,7 +11081,7 @@
         <w:pStyle w:val="ListParagraph"/>
         <w:numPr>
           <w:ilvl w:val="0"/>
-          <w:numId w:val="14"/>
+          <w:numId w:val="6"/>
         </w:numPr>
         <w:rPr>
           <w:lang w:val="vi-VN"/>
@@ -11107,7 +11101,7 @@
         <w:pStyle w:val="ListParagraph"/>
         <w:numPr>
           <w:ilvl w:val="0"/>
-          <w:numId w:val="14"/>
+          <w:numId w:val="6"/>
         </w:numPr>
         <w:rPr>
           <w:lang w:val="vi-VN"/>
@@ -11127,7 +11121,7 @@
         <w:pStyle w:val="ListParagraph"/>
         <w:numPr>
           <w:ilvl w:val="0"/>
-          <w:numId w:val="14"/>
+          <w:numId w:val="6"/>
         </w:numPr>
         <w:rPr>
           <w:lang w:val="vi-VN"/>
@@ -11176,7 +11170,7 @@
         <w:pStyle w:val="ListParagraph"/>
         <w:numPr>
           <w:ilvl w:val="0"/>
-          <w:numId w:val="15"/>
+          <w:numId w:val="7"/>
         </w:numPr>
         <w:rPr>
           <w:lang w:val="vi-VN"/>
@@ -11226,7 +11220,7 @@
         <w:pStyle w:val="ListParagraph"/>
         <w:numPr>
           <w:ilvl w:val="0"/>
-          <w:numId w:val="15"/>
+          <w:numId w:val="7"/>
         </w:numPr>
         <w:rPr>
           <w:rStyle w:val="fontstyle21"/>
@@ -11292,6 +11286,7 @@
         <w:rPr>
           <w:rStyle w:val="fontstyle21"/>
           <w:rFonts w:ascii="Times New Roman" w:hAnsi="Times New Roman"/>
+          <w:noProof/>
           <w:color w:val="auto"/>
           <w:sz w:val="24"/>
           <w:szCs w:val="24"/>
@@ -11474,7 +11469,7 @@
         <w:pStyle w:val="ListParagraph"/>
         <w:numPr>
           <w:ilvl w:val="0"/>
-          <w:numId w:val="27"/>
+          <w:numId w:val="10"/>
         </w:numPr>
         <w:rPr>
           <w:lang w:val="vi-VN"/>
@@ -11502,7 +11497,7 @@
         <w:pStyle w:val="ListParagraph"/>
         <w:numPr>
           <w:ilvl w:val="0"/>
-          <w:numId w:val="27"/>
+          <w:numId w:val="10"/>
         </w:numPr>
         <w:rPr>
           <w:lang w:val="vi-VN"/>
@@ -11522,7 +11517,7 @@
         <w:pStyle w:val="ListParagraph"/>
         <w:numPr>
           <w:ilvl w:val="0"/>
-          <w:numId w:val="27"/>
+          <w:numId w:val="10"/>
         </w:numPr>
         <w:rPr>
           <w:lang w:val="vi-VN"/>
@@ -11574,7 +11569,7 @@
         <w:pStyle w:val="ListParagraph"/>
         <w:numPr>
           <w:ilvl w:val="0"/>
-          <w:numId w:val="27"/>
+          <w:numId w:val="10"/>
         </w:numPr>
         <w:rPr>
           <w:lang w:val="vi-VN"/>
@@ -11594,7 +11589,7 @@
         <w:pStyle w:val="ListParagraph"/>
         <w:numPr>
           <w:ilvl w:val="0"/>
-          <w:numId w:val="27"/>
+          <w:numId w:val="10"/>
         </w:numPr>
         <w:rPr>
           <w:lang w:val="vi-VN"/>
@@ -11630,7 +11625,7 @@
         <w:pStyle w:val="ListParagraph"/>
         <w:numPr>
           <w:ilvl w:val="0"/>
-          <w:numId w:val="27"/>
+          <w:numId w:val="10"/>
         </w:numPr>
         <w:rPr>
           <w:lang w:val="vi-VN"/>
@@ -11650,7 +11645,7 @@
         <w:pStyle w:val="ListParagraph"/>
         <w:numPr>
           <w:ilvl w:val="0"/>
-          <w:numId w:val="27"/>
+          <w:numId w:val="10"/>
         </w:numPr>
         <w:rPr>
           <w:lang w:val="vi-VN"/>
@@ -11685,7 +11680,7 @@
         <w:pStyle w:val="ListParagraph"/>
         <w:numPr>
           <w:ilvl w:val="0"/>
-          <w:numId w:val="25"/>
+          <w:numId w:val="9"/>
         </w:numPr>
         <w:rPr>
           <w:lang w:val="vi-VN"/>
@@ -11719,7 +11714,7 @@
         <w:pStyle w:val="ListParagraph"/>
         <w:numPr>
           <w:ilvl w:val="0"/>
-          <w:numId w:val="25"/>
+          <w:numId w:val="9"/>
         </w:numPr>
         <w:rPr>
           <w:rStyle w:val="fontstyle21"/>
@@ -11769,6 +11764,7 @@
       </w:pPr>
       <w:r>
         <w:rPr>
+          <w:noProof/>
           <w:lang w:val="vi-VN"/>
         </w:rPr>
         <w:lastRenderedPageBreak/>
@@ -11966,7 +11962,7 @@
         <w:pStyle w:val="ListParagraph"/>
         <w:numPr>
           <w:ilvl w:val="0"/>
-          <w:numId w:val="28"/>
+          <w:numId w:val="11"/>
         </w:numPr>
         <w:rPr>
           <w:lang w:val="vi-VN"/>
@@ -11986,7 +11982,7 @@
         <w:pStyle w:val="ListParagraph"/>
         <w:numPr>
           <w:ilvl w:val="0"/>
-          <w:numId w:val="28"/>
+          <w:numId w:val="11"/>
         </w:numPr>
         <w:rPr>
           <w:lang w:val="vi-VN"/>
@@ -12006,7 +12002,7 @@
         <w:pStyle w:val="ListParagraph"/>
         <w:numPr>
           <w:ilvl w:val="0"/>
-          <w:numId w:val="28"/>
+          <w:numId w:val="11"/>
         </w:numPr>
         <w:rPr>
           <w:lang w:val="vi-VN"/>
@@ -12026,7 +12022,7 @@
         <w:pStyle w:val="ListParagraph"/>
         <w:numPr>
           <w:ilvl w:val="0"/>
-          <w:numId w:val="28"/>
+          <w:numId w:val="11"/>
         </w:numPr>
         <w:rPr>
           <w:lang w:val="vi-VN"/>
@@ -12046,7 +12042,7 @@
         <w:pStyle w:val="ListParagraph"/>
         <w:numPr>
           <w:ilvl w:val="0"/>
-          <w:numId w:val="28"/>
+          <w:numId w:val="11"/>
         </w:numPr>
       </w:pPr>
       <w:r>
@@ -12054,23 +12050,7 @@
           <w:rStyle w:val="fontstyle21"/>
           <w:rFonts w:ascii="Times New Roman" w:hAnsi="Times New Roman"/>
         </w:rPr>
-        <w:t xml:space="preserve">Người dùng chọn trạng thái mới: In-Process, </w:t>
-      </w:r>
-      <w:proofErr w:type="gramStart"/>
-      <w:r>
-        <w:rPr>
-          <w:rStyle w:val="fontstyle21"/>
-          <w:rFonts w:ascii="Times New Roman" w:hAnsi="Times New Roman"/>
-        </w:rPr>
-        <w:t>Hold</w:t>
-      </w:r>
-      <w:proofErr w:type="gramEnd"/>
-      <w:r>
-        <w:rPr>
-          <w:rStyle w:val="fontstyle21"/>
-          <w:rFonts w:ascii="Times New Roman" w:hAnsi="Times New Roman"/>
-        </w:rPr>
-        <w:t xml:space="preserve"> hoặc Completed.</w:t>
+        <w:t>Người dùng chọn trạng thái mới: In-Process, Hold hoặc Completed.</w:t>
       </w:r>
     </w:p>
     <w:p>
@@ -12078,7 +12058,7 @@
         <w:pStyle w:val="ListParagraph"/>
         <w:numPr>
           <w:ilvl w:val="0"/>
-          <w:numId w:val="28"/>
+          <w:numId w:val="11"/>
         </w:numPr>
       </w:pPr>
       <w:r>
@@ -12094,7 +12074,7 @@
         <w:pStyle w:val="ListParagraph"/>
         <w:numPr>
           <w:ilvl w:val="0"/>
-          <w:numId w:val="28"/>
+          <w:numId w:val="11"/>
         </w:numPr>
       </w:pPr>
       <w:r>
@@ -12110,7 +12090,7 @@
         <w:pStyle w:val="ListParagraph"/>
         <w:numPr>
           <w:ilvl w:val="0"/>
-          <w:numId w:val="28"/>
+          <w:numId w:val="11"/>
         </w:numPr>
         <w:rPr>
           <w:rStyle w:val="fontstyle21"/>
@@ -12161,7 +12141,7 @@
         <w:pStyle w:val="ListParagraph"/>
         <w:numPr>
           <w:ilvl w:val="0"/>
-          <w:numId w:val="29"/>
+          <w:numId w:val="12"/>
         </w:numPr>
         <w:rPr>
           <w:lang w:val="vi-VN"/>
@@ -12195,7 +12175,7 @@
         <w:pStyle w:val="ListParagraph"/>
         <w:numPr>
           <w:ilvl w:val="0"/>
-          <w:numId w:val="29"/>
+          <w:numId w:val="12"/>
         </w:numPr>
         <w:rPr>
           <w:rStyle w:val="fontstyle21"/>
@@ -12238,6 +12218,7 @@
       </w:pPr>
       <w:r>
         <w:rPr>
+          <w:noProof/>
           <w:lang w:val="vi-VN"/>
         </w:rPr>
         <w:lastRenderedPageBreak/>
@@ -12432,7 +12413,7 @@
         <w:pStyle w:val="ListParagraph"/>
         <w:numPr>
           <w:ilvl w:val="0"/>
-          <w:numId w:val="31"/>
+          <w:numId w:val="14"/>
         </w:numPr>
       </w:pPr>
       <w:r>
@@ -12448,7 +12429,7 @@
         <w:pStyle w:val="ListParagraph"/>
         <w:numPr>
           <w:ilvl w:val="0"/>
-          <w:numId w:val="31"/>
+          <w:numId w:val="14"/>
         </w:numPr>
       </w:pPr>
       <w:r>
@@ -12464,7 +12445,7 @@
         <w:pStyle w:val="ListParagraph"/>
         <w:numPr>
           <w:ilvl w:val="0"/>
-          <w:numId w:val="31"/>
+          <w:numId w:val="14"/>
         </w:numPr>
       </w:pPr>
       <w:r>
@@ -12495,7 +12476,7 @@
         <w:pStyle w:val="ListParagraph"/>
         <w:numPr>
           <w:ilvl w:val="0"/>
-          <w:numId w:val="31"/>
+          <w:numId w:val="14"/>
         </w:numPr>
       </w:pPr>
       <w:r>
@@ -12511,7 +12492,7 @@
         <w:pStyle w:val="ListParagraph"/>
         <w:numPr>
           <w:ilvl w:val="0"/>
-          <w:numId w:val="31"/>
+          <w:numId w:val="14"/>
         </w:numPr>
       </w:pPr>
       <w:r>
@@ -12527,7 +12508,7 @@
         <w:pStyle w:val="ListParagraph"/>
         <w:numPr>
           <w:ilvl w:val="0"/>
-          <w:numId w:val="31"/>
+          <w:numId w:val="14"/>
         </w:numPr>
       </w:pPr>
       <w:r>
@@ -12543,7 +12524,7 @@
         <w:pStyle w:val="ListParagraph"/>
         <w:numPr>
           <w:ilvl w:val="0"/>
-          <w:numId w:val="31"/>
+          <w:numId w:val="14"/>
         </w:numPr>
       </w:pPr>
       <w:r>
@@ -12559,7 +12540,7 @@
         <w:pStyle w:val="ListParagraph"/>
         <w:numPr>
           <w:ilvl w:val="0"/>
-          <w:numId w:val="31"/>
+          <w:numId w:val="14"/>
         </w:numPr>
       </w:pPr>
       <w:r>
@@ -12584,7 +12565,7 @@
         <w:pStyle w:val="ListParagraph"/>
         <w:numPr>
           <w:ilvl w:val="0"/>
-          <w:numId w:val="30"/>
+          <w:numId w:val="13"/>
         </w:numPr>
       </w:pPr>
       <w:r>
@@ -12622,7 +12603,7 @@
         <w:pStyle w:val="ListParagraph"/>
         <w:numPr>
           <w:ilvl w:val="0"/>
-          <w:numId w:val="30"/>
+          <w:numId w:val="13"/>
         </w:numPr>
         <w:rPr>
           <w:rStyle w:val="fontstyle21"/>
@@ -12658,6 +12639,9 @@
         <w:jc w:val="center"/>
       </w:pPr>
       <w:r>
+        <w:rPr>
+          <w:noProof/>
+        </w:rPr>
         <w:lastRenderedPageBreak/>
         <w:drawing>
           <wp:inline distT="0" distB="0" distL="0" distR="0" wp14:anchorId="631A28D2" wp14:editId="65DB01AC">
@@ -12864,7 +12848,7 @@
         <w:pStyle w:val="ListParagraph"/>
         <w:numPr>
           <w:ilvl w:val="0"/>
-          <w:numId w:val="33"/>
+          <w:numId w:val="16"/>
         </w:numPr>
       </w:pPr>
       <w:r>
@@ -12880,7 +12864,7 @@
         <w:pStyle w:val="ListParagraph"/>
         <w:numPr>
           <w:ilvl w:val="0"/>
-          <w:numId w:val="33"/>
+          <w:numId w:val="16"/>
         </w:numPr>
       </w:pPr>
       <w:r>
@@ -12896,7 +12880,7 @@
         <w:pStyle w:val="ListParagraph"/>
         <w:numPr>
           <w:ilvl w:val="0"/>
-          <w:numId w:val="33"/>
+          <w:numId w:val="16"/>
         </w:numPr>
       </w:pPr>
       <w:r>
@@ -12925,7 +12909,7 @@
         <w:pStyle w:val="ListParagraph"/>
         <w:numPr>
           <w:ilvl w:val="0"/>
-          <w:numId w:val="33"/>
+          <w:numId w:val="16"/>
         </w:numPr>
       </w:pPr>
       <w:r>
@@ -12941,7 +12925,7 @@
         <w:pStyle w:val="ListParagraph"/>
         <w:numPr>
           <w:ilvl w:val="0"/>
-          <w:numId w:val="33"/>
+          <w:numId w:val="16"/>
         </w:numPr>
       </w:pPr>
       <w:r>
@@ -12957,7 +12941,7 @@
         <w:pStyle w:val="ListParagraph"/>
         <w:numPr>
           <w:ilvl w:val="0"/>
-          <w:numId w:val="33"/>
+          <w:numId w:val="16"/>
         </w:numPr>
       </w:pPr>
       <w:r>
@@ -12973,7 +12957,7 @@
         <w:pStyle w:val="ListParagraph"/>
         <w:numPr>
           <w:ilvl w:val="0"/>
-          <w:numId w:val="33"/>
+          <w:numId w:val="16"/>
         </w:numPr>
         <w:rPr>
           <w:rStyle w:val="fontstyle21"/>
@@ -13024,7 +13008,7 @@
         <w:pStyle w:val="ListParagraph"/>
         <w:numPr>
           <w:ilvl w:val="0"/>
-          <w:numId w:val="32"/>
+          <w:numId w:val="15"/>
         </w:numPr>
         <w:rPr>
           <w:lang w:val="vi-VN"/>
@@ -13066,7 +13050,7 @@
         <w:pStyle w:val="ListParagraph"/>
         <w:numPr>
           <w:ilvl w:val="0"/>
-          <w:numId w:val="32"/>
+          <w:numId w:val="15"/>
         </w:numPr>
         <w:rPr>
           <w:rStyle w:val="fontstyle21"/>
@@ -13109,6 +13093,7 @@
         <w:rPr>
           <w:b/>
           <w:bCs/>
+          <w:noProof/>
           <w:color w:val="000000"/>
           <w:sz w:val="26"/>
           <w:szCs w:val="26"/>
@@ -13541,7 +13526,7 @@
         <w:pStyle w:val="ListParagraph"/>
         <w:numPr>
           <w:ilvl w:val="0"/>
-          <w:numId w:val="42"/>
+          <w:numId w:val="24"/>
         </w:numPr>
         <w:rPr>
           <w:sz w:val="26"/>
@@ -13587,7 +13572,7 @@
         <w:pStyle w:val="ListParagraph"/>
         <w:numPr>
           <w:ilvl w:val="0"/>
-          <w:numId w:val="42"/>
+          <w:numId w:val="24"/>
         </w:numPr>
         <w:rPr>
           <w:sz w:val="26"/>
@@ -13610,7 +13595,7 @@
         <w:pStyle w:val="ListParagraph"/>
         <w:numPr>
           <w:ilvl w:val="0"/>
-          <w:numId w:val="42"/>
+          <w:numId w:val="24"/>
         </w:numPr>
         <w:rPr>
           <w:sz w:val="26"/>
@@ -13632,7 +13617,7 @@
         <w:pStyle w:val="ListParagraph"/>
         <w:numPr>
           <w:ilvl w:val="0"/>
-          <w:numId w:val="42"/>
+          <w:numId w:val="24"/>
         </w:numPr>
         <w:rPr>
           <w:sz w:val="26"/>
@@ -13654,7 +13639,7 @@
         <w:pStyle w:val="ListParagraph"/>
         <w:numPr>
           <w:ilvl w:val="0"/>
-          <w:numId w:val="42"/>
+          <w:numId w:val="24"/>
         </w:numPr>
         <w:rPr>
           <w:sz w:val="26"/>
@@ -13931,7 +13916,7 @@
         <w:pStyle w:val="ListParagraph"/>
         <w:numPr>
           <w:ilvl w:val="0"/>
-          <w:numId w:val="43"/>
+          <w:numId w:val="25"/>
         </w:numPr>
         <w:spacing w:after="200"/>
         <w:rPr>
@@ -13954,7 +13939,7 @@
         <w:pStyle w:val="ListParagraph"/>
         <w:numPr>
           <w:ilvl w:val="0"/>
-          <w:numId w:val="43"/>
+          <w:numId w:val="25"/>
         </w:numPr>
         <w:spacing w:after="200"/>
         <w:rPr>
@@ -13993,7 +13978,7 @@
         <w:pStyle w:val="ListParagraph"/>
         <w:numPr>
           <w:ilvl w:val="0"/>
-          <w:numId w:val="43"/>
+          <w:numId w:val="25"/>
         </w:numPr>
         <w:spacing w:after="200"/>
         <w:rPr>
@@ -14016,7 +14001,7 @@
         <w:pStyle w:val="ListParagraph"/>
         <w:numPr>
           <w:ilvl w:val="0"/>
-          <w:numId w:val="43"/>
+          <w:numId w:val="25"/>
         </w:numPr>
         <w:spacing w:after="200"/>
         <w:rPr>
@@ -14272,7 +14257,7 @@
         <w:pStyle w:val="ListParagraph"/>
         <w:numPr>
           <w:ilvl w:val="0"/>
-          <w:numId w:val="44"/>
+          <w:numId w:val="26"/>
         </w:numPr>
         <w:spacing w:after="200"/>
         <w:rPr>
@@ -14295,7 +14280,7 @@
         <w:pStyle w:val="ListParagraph"/>
         <w:numPr>
           <w:ilvl w:val="0"/>
-          <w:numId w:val="44"/>
+          <w:numId w:val="26"/>
         </w:numPr>
         <w:spacing w:after="200"/>
         <w:rPr>
@@ -14318,7 +14303,7 @@
         <w:pStyle w:val="ListParagraph"/>
         <w:numPr>
           <w:ilvl w:val="0"/>
-          <w:numId w:val="44"/>
+          <w:numId w:val="26"/>
         </w:numPr>
         <w:spacing w:after="200"/>
         <w:rPr>
@@ -14341,7 +14326,7 @@
         <w:pStyle w:val="ListParagraph"/>
         <w:numPr>
           <w:ilvl w:val="0"/>
-          <w:numId w:val="44"/>
+          <w:numId w:val="26"/>
         </w:numPr>
         <w:spacing w:after="200"/>
         <w:rPr>
@@ -14575,7 +14560,7 @@
         <w:pStyle w:val="ListParagraph"/>
         <w:numPr>
           <w:ilvl w:val="0"/>
-          <w:numId w:val="45"/>
+          <w:numId w:val="27"/>
         </w:numPr>
         <w:spacing w:after="200"/>
         <w:rPr>
@@ -14598,7 +14583,7 @@
         <w:pStyle w:val="ListParagraph"/>
         <w:numPr>
           <w:ilvl w:val="0"/>
-          <w:numId w:val="45"/>
+          <w:numId w:val="27"/>
         </w:numPr>
         <w:spacing w:after="200"/>
         <w:rPr>
@@ -14621,7 +14606,7 @@
         <w:pStyle w:val="ListParagraph"/>
         <w:numPr>
           <w:ilvl w:val="0"/>
-          <w:numId w:val="45"/>
+          <w:numId w:val="27"/>
         </w:numPr>
         <w:spacing w:after="200"/>
         <w:rPr>
@@ -14644,7 +14629,7 @@
         <w:pStyle w:val="ListParagraph"/>
         <w:numPr>
           <w:ilvl w:val="0"/>
-          <w:numId w:val="45"/>
+          <w:numId w:val="27"/>
         </w:numPr>
         <w:spacing w:after="200"/>
         <w:rPr>
@@ -14869,7 +14854,7 @@
         <w:pStyle w:val="ListParagraph"/>
         <w:numPr>
           <w:ilvl w:val="0"/>
-          <w:numId w:val="46"/>
+          <w:numId w:val="28"/>
         </w:numPr>
         <w:spacing w:after="200"/>
         <w:rPr>
@@ -14892,7 +14877,7 @@
         <w:pStyle w:val="ListParagraph"/>
         <w:numPr>
           <w:ilvl w:val="0"/>
-          <w:numId w:val="46"/>
+          <w:numId w:val="28"/>
         </w:numPr>
         <w:spacing w:after="200"/>
         <w:rPr>
@@ -14915,7 +14900,7 @@
         <w:pStyle w:val="ListParagraph"/>
         <w:numPr>
           <w:ilvl w:val="0"/>
-          <w:numId w:val="46"/>
+          <w:numId w:val="28"/>
         </w:numPr>
         <w:spacing w:after="200"/>
         <w:rPr>
@@ -14939,7 +14924,7 @@
         <w:pStyle w:val="ListParagraph"/>
         <w:numPr>
           <w:ilvl w:val="0"/>
-          <w:numId w:val="46"/>
+          <w:numId w:val="28"/>
         </w:numPr>
         <w:spacing w:after="200"/>
         <w:rPr>
@@ -15148,7 +15133,7 @@
         <w:pStyle w:val="ListParagraph"/>
         <w:numPr>
           <w:ilvl w:val="0"/>
-          <w:numId w:val="47"/>
+          <w:numId w:val="29"/>
         </w:numPr>
         <w:spacing w:after="200"/>
         <w:rPr>
@@ -15171,7 +15156,7 @@
         <w:pStyle w:val="ListParagraph"/>
         <w:numPr>
           <w:ilvl w:val="0"/>
-          <w:numId w:val="47"/>
+          <w:numId w:val="29"/>
         </w:numPr>
         <w:spacing w:after="200"/>
         <w:rPr>
@@ -15194,7 +15179,7 @@
         <w:pStyle w:val="ListParagraph"/>
         <w:numPr>
           <w:ilvl w:val="0"/>
-          <w:numId w:val="47"/>
+          <w:numId w:val="29"/>
         </w:numPr>
         <w:spacing w:after="200"/>
         <w:rPr>
@@ -15410,7 +15395,7 @@
         <w:pStyle w:val="ListParagraph"/>
         <w:numPr>
           <w:ilvl w:val="0"/>
-          <w:numId w:val="48"/>
+          <w:numId w:val="30"/>
         </w:numPr>
         <w:spacing w:after="200"/>
         <w:rPr>
@@ -15433,7 +15418,7 @@
         <w:pStyle w:val="ListParagraph"/>
         <w:numPr>
           <w:ilvl w:val="0"/>
-          <w:numId w:val="48"/>
+          <w:numId w:val="30"/>
         </w:numPr>
         <w:spacing w:after="200"/>
         <w:rPr>
@@ -15456,7 +15441,7 @@
         <w:pStyle w:val="ListParagraph"/>
         <w:numPr>
           <w:ilvl w:val="0"/>
-          <w:numId w:val="48"/>
+          <w:numId w:val="30"/>
         </w:numPr>
         <w:spacing w:after="200"/>
         <w:rPr>
@@ -15479,7 +15464,7 @@
         <w:pStyle w:val="ListParagraph"/>
         <w:numPr>
           <w:ilvl w:val="0"/>
-          <w:numId w:val="48"/>
+          <w:numId w:val="30"/>
         </w:numPr>
         <w:spacing w:after="200"/>
         <w:rPr>
@@ -15712,7 +15697,7 @@
         <w:pStyle w:val="ListParagraph"/>
         <w:numPr>
           <w:ilvl w:val="0"/>
-          <w:numId w:val="49"/>
+          <w:numId w:val="31"/>
         </w:numPr>
         <w:spacing w:after="200"/>
         <w:rPr>
@@ -15735,7 +15720,7 @@
         <w:pStyle w:val="ListParagraph"/>
         <w:numPr>
           <w:ilvl w:val="0"/>
-          <w:numId w:val="49"/>
+          <w:numId w:val="31"/>
         </w:numPr>
         <w:spacing w:after="200"/>
         <w:rPr>
@@ -15758,7 +15743,7 @@
         <w:pStyle w:val="ListParagraph"/>
         <w:numPr>
           <w:ilvl w:val="0"/>
-          <w:numId w:val="49"/>
+          <w:numId w:val="31"/>
         </w:numPr>
         <w:spacing w:after="200"/>
         <w:rPr>
@@ -16044,7 +16029,7 @@
         <w:pStyle w:val="ListParagraph"/>
         <w:numPr>
           <w:ilvl w:val="0"/>
-          <w:numId w:val="50"/>
+          <w:numId w:val="32"/>
         </w:numPr>
         <w:spacing w:after="200"/>
         <w:rPr>
@@ -16067,7 +16052,7 @@
         <w:pStyle w:val="ListParagraph"/>
         <w:numPr>
           <w:ilvl w:val="0"/>
-          <w:numId w:val="50"/>
+          <w:numId w:val="32"/>
         </w:numPr>
         <w:spacing w:after="200"/>
         <w:rPr>
@@ -16090,7 +16075,7 @@
         <w:pStyle w:val="ListParagraph"/>
         <w:numPr>
           <w:ilvl w:val="0"/>
-          <w:numId w:val="50"/>
+          <w:numId w:val="32"/>
         </w:numPr>
         <w:spacing w:after="200"/>
         <w:rPr>
@@ -16113,7 +16098,7 @@
         <w:pStyle w:val="ListParagraph"/>
         <w:numPr>
           <w:ilvl w:val="0"/>
-          <w:numId w:val="50"/>
+          <w:numId w:val="32"/>
         </w:numPr>
         <w:spacing w:after="200"/>
         <w:rPr>
@@ -16350,15 +16335,7 @@
         <w:t>Clean Architecture kết hợp Repository Pattern</w:t>
       </w:r>
       <w:r>
-        <w:t xml:space="preserve"> trên nền tảng .NET 8. Việc sử dụng Clean Architecture giúp hệ thống tuân thủ chặt chẽ nguyên lý Dependency Inversion, tách biệt hoàn toàn Core </w:t>
-      </w:r>
-      <w:proofErr w:type="gramStart"/>
-      <w:r>
-        <w:t>Domain  khỏi</w:t>
-      </w:r>
-      <w:proofErr w:type="gramEnd"/>
-      <w:r>
-        <w:t xml:space="preserve"> các phụ thuộc hạ tầng, từ đó nâng cao tính khả thử  và khả năng mở rộng. Sơ đồ dưới đây tập trung vào luồng xử lý Lô sản xuất.</w:t>
+        <w:t xml:space="preserve"> trên nền tảng .NET 8. Việc sử dụng Clean Architecture giúp hệ thống tuân thủ chặt chẽ nguyên lý Dependency Inversion, tách biệt hoàn toàn Core Domain  khỏi các phụ thuộc hạ tầng, từ đó nâng cao tính khả thử  và khả năng mở rộng. Sơ đồ dưới đây tập trung vào luồng xử lý Lô sản xuất.</w:t>
       </w:r>
     </w:p>
     <w:p>
@@ -16398,7 +16375,7 @@
         <w:pStyle w:val="ListParagraph"/>
         <w:numPr>
           <w:ilvl w:val="0"/>
-          <w:numId w:val="2"/>
+          <w:numId w:val="1"/>
         </w:numPr>
         <w:spacing w:after="100"/>
         <w:rPr>
@@ -16435,7 +16412,7 @@
         <w:pStyle w:val="ListParagraph"/>
         <w:numPr>
           <w:ilvl w:val="0"/>
-          <w:numId w:val="2"/>
+          <w:numId w:val="1"/>
         </w:numPr>
         <w:spacing w:after="100"/>
         <w:rPr>
@@ -16472,7 +16449,7 @@
         <w:pStyle w:val="ListParagraph"/>
         <w:numPr>
           <w:ilvl w:val="0"/>
-          <w:numId w:val="2"/>
+          <w:numId w:val="1"/>
         </w:numPr>
         <w:spacing w:after="100"/>
         <w:rPr>
@@ -16487,7 +16464,6 @@
         </w:rPr>
         <w:t xml:space="preserve">AuditLogInterceptor: Một middleware can thiệp vào tầng Entity Framework Core. Bất cứ khi nào </w:t>
       </w:r>
-      <w:proofErr w:type="gramStart"/>
       <w:r>
         <w:rPr>
           <w:rFonts w:eastAsia="Courier New"/>
@@ -16495,17 +16471,7 @@
           <w:szCs w:val="26"/>
           <w:shd w:val="clear" w:color="auto" w:fill="F1F5F9"/>
         </w:rPr>
-        <w:t>SaveChangesAsync(</w:t>
-      </w:r>
-      <w:proofErr w:type="gramEnd"/>
-      <w:r>
-        <w:rPr>
-          <w:rFonts w:eastAsia="Courier New"/>
-          <w:sz w:val="26"/>
-          <w:szCs w:val="26"/>
-          <w:shd w:val="clear" w:color="auto" w:fill="F1F5F9"/>
-        </w:rPr>
-        <w:t>)</w:t>
+        <w:t>SaveChangesAsync()</w:t>
       </w:r>
       <w:r>
         <w:rPr>
@@ -16686,7 +16652,7 @@
         <w:pStyle w:val="ListParagraph"/>
         <w:numPr>
           <w:ilvl w:val="1"/>
-          <w:numId w:val="2"/>
+          <w:numId w:val="1"/>
         </w:numPr>
         <w:spacing w:after="100"/>
         <w:rPr>
@@ -16707,7 +16673,7 @@
         <w:pStyle w:val="ListParagraph"/>
         <w:numPr>
           <w:ilvl w:val="1"/>
-          <w:numId w:val="2"/>
+          <w:numId w:val="1"/>
         </w:numPr>
         <w:spacing w:after="100"/>
         <w:rPr>
@@ -16744,7 +16710,7 @@
         <w:pStyle w:val="ListParagraph"/>
         <w:numPr>
           <w:ilvl w:val="1"/>
-          <w:numId w:val="2"/>
+          <w:numId w:val="1"/>
         </w:numPr>
         <w:spacing w:after="100"/>
         <w:rPr>
@@ -16782,7 +16748,7 @@
         <w:pStyle w:val="ListParagraph"/>
         <w:numPr>
           <w:ilvl w:val="1"/>
-          <w:numId w:val="2"/>
+          <w:numId w:val="1"/>
         </w:numPr>
         <w:spacing w:after="100"/>
         <w:rPr>
@@ -16803,7 +16769,7 @@
         <w:pStyle w:val="ListParagraph"/>
         <w:numPr>
           <w:ilvl w:val="1"/>
-          <w:numId w:val="2"/>
+          <w:numId w:val="1"/>
         </w:numPr>
         <w:spacing w:after="100"/>
         <w:rPr>
@@ -16824,7 +16790,7 @@
         <w:pStyle w:val="ListParagraph"/>
         <w:numPr>
           <w:ilvl w:val="1"/>
-          <w:numId w:val="2"/>
+          <w:numId w:val="1"/>
         </w:numPr>
         <w:spacing w:after="100"/>
         <w:rPr>
@@ -16890,7 +16856,7 @@
         <w:pStyle w:val="ListParagraph"/>
         <w:numPr>
           <w:ilvl w:val="0"/>
-          <w:numId w:val="2"/>
+          <w:numId w:val="1"/>
         </w:numPr>
         <w:spacing w:after="100"/>
       </w:pPr>
@@ -16910,7 +16876,7 @@
         <w:pStyle w:val="ListParagraph"/>
         <w:numPr>
           <w:ilvl w:val="0"/>
-          <w:numId w:val="2"/>
+          <w:numId w:val="1"/>
         </w:numPr>
         <w:spacing w:after="100"/>
       </w:pPr>
@@ -16930,7 +16896,7 @@
         <w:pStyle w:val="ListParagraph"/>
         <w:numPr>
           <w:ilvl w:val="0"/>
-          <w:numId w:val="2"/>
+          <w:numId w:val="1"/>
         </w:numPr>
         <w:spacing w:after="100"/>
       </w:pPr>
@@ -16950,7 +16916,7 @@
         <w:pStyle w:val="ListParagraph"/>
         <w:numPr>
           <w:ilvl w:val="0"/>
-          <w:numId w:val="2"/>
+          <w:numId w:val="1"/>
         </w:numPr>
         <w:spacing w:after="100"/>
       </w:pPr>
@@ -16983,7 +16949,7 @@
         <w:pStyle w:val="ListParagraph"/>
         <w:numPr>
           <w:ilvl w:val="0"/>
-          <w:numId w:val="2"/>
+          <w:numId w:val="1"/>
         </w:numPr>
         <w:spacing w:after="100"/>
         <w:rPr>
@@ -17066,7 +17032,7 @@
         <w:pStyle w:val="ListParagraph"/>
         <w:numPr>
           <w:ilvl w:val="0"/>
-          <w:numId w:val="2"/>
+          <w:numId w:val="1"/>
         </w:numPr>
         <w:spacing w:after="100"/>
         <w:rPr>
@@ -17796,7 +17762,7 @@
         <w:pStyle w:val="ListParagraph"/>
         <w:numPr>
           <w:ilvl w:val="0"/>
-          <w:numId w:val="2"/>
+          <w:numId w:val="1"/>
         </w:numPr>
         <w:spacing w:after="100"/>
       </w:pPr>
@@ -17826,7 +17792,7 @@
         <w:pStyle w:val="ListParagraph"/>
         <w:numPr>
           <w:ilvl w:val="0"/>
-          <w:numId w:val="2"/>
+          <w:numId w:val="1"/>
         </w:numPr>
         <w:spacing w:after="100"/>
       </w:pPr>
@@ -17856,7 +17822,7 @@
         <w:pStyle w:val="ListParagraph"/>
         <w:numPr>
           <w:ilvl w:val="0"/>
-          <w:numId w:val="2"/>
+          <w:numId w:val="1"/>
         </w:numPr>
         <w:spacing w:after="100"/>
       </w:pPr>
@@ -17955,7 +17921,7 @@
         <w:pStyle w:val="ListParagraph"/>
         <w:numPr>
           <w:ilvl w:val="0"/>
-          <w:numId w:val="2"/>
+          <w:numId w:val="1"/>
         </w:numPr>
         <w:spacing w:after="100"/>
       </w:pPr>
@@ -17975,7 +17941,7 @@
         <w:pStyle w:val="ListParagraph"/>
         <w:numPr>
           <w:ilvl w:val="0"/>
-          <w:numId w:val="2"/>
+          <w:numId w:val="1"/>
         </w:numPr>
         <w:spacing w:after="100"/>
       </w:pPr>
@@ -17995,7 +17961,7 @@
         <w:pStyle w:val="ListParagraph"/>
         <w:numPr>
           <w:ilvl w:val="0"/>
-          <w:numId w:val="2"/>
+          <w:numId w:val="1"/>
         </w:numPr>
         <w:spacing w:after="100"/>
       </w:pPr>
@@ -18043,7 +18009,7 @@
         <w:pStyle w:val="ListParagraph"/>
         <w:numPr>
           <w:ilvl w:val="0"/>
-          <w:numId w:val="2"/>
+          <w:numId w:val="1"/>
         </w:numPr>
         <w:spacing w:before="240" w:after="100"/>
       </w:pPr>
@@ -18201,7 +18167,7 @@
         <w:pStyle w:val="ListParagraph"/>
         <w:numPr>
           <w:ilvl w:val="0"/>
-          <w:numId w:val="2"/>
+          <w:numId w:val="1"/>
         </w:numPr>
         <w:spacing w:before="240" w:after="100"/>
       </w:pPr>
@@ -18399,7 +18365,7 @@
         <w:pStyle w:val="ListParagraph"/>
         <w:numPr>
           <w:ilvl w:val="0"/>
-          <w:numId w:val="2"/>
+          <w:numId w:val="1"/>
         </w:numPr>
         <w:spacing w:after="100"/>
       </w:pPr>
@@ -18447,7 +18413,7 @@
         <w:pStyle w:val="ListParagraph"/>
         <w:numPr>
           <w:ilvl w:val="0"/>
-          <w:numId w:val="2"/>
+          <w:numId w:val="1"/>
         </w:numPr>
         <w:spacing w:after="100"/>
       </w:pPr>
@@ -18467,7 +18433,7 @@
         <w:pStyle w:val="ListParagraph"/>
         <w:numPr>
           <w:ilvl w:val="0"/>
-          <w:numId w:val="2"/>
+          <w:numId w:val="1"/>
         </w:numPr>
         <w:spacing w:after="100"/>
       </w:pPr>
@@ -18497,7 +18463,7 @@
         <w:pStyle w:val="ListParagraph"/>
         <w:numPr>
           <w:ilvl w:val="0"/>
-          <w:numId w:val="2"/>
+          <w:numId w:val="1"/>
         </w:numPr>
         <w:spacing w:after="100"/>
       </w:pPr>
@@ -18544,7 +18510,7 @@
         <w:pStyle w:val="ListParagraph"/>
         <w:numPr>
           <w:ilvl w:val="0"/>
-          <w:numId w:val="2"/>
+          <w:numId w:val="1"/>
         </w:numPr>
         <w:spacing w:after="100"/>
       </w:pPr>
@@ -18564,7 +18530,7 @@
         <w:pStyle w:val="ListParagraph"/>
         <w:numPr>
           <w:ilvl w:val="0"/>
-          <w:numId w:val="2"/>
+          <w:numId w:val="1"/>
         </w:numPr>
         <w:spacing w:after="100"/>
       </w:pPr>
@@ -18634,7 +18600,7 @@
         <w:pStyle w:val="ListParagraph"/>
         <w:numPr>
           <w:ilvl w:val="0"/>
-          <w:numId w:val="2"/>
+          <w:numId w:val="1"/>
         </w:numPr>
         <w:spacing w:after="100"/>
       </w:pPr>
@@ -18698,7 +18664,7 @@
         <w:pStyle w:val="ListParagraph"/>
         <w:numPr>
           <w:ilvl w:val="0"/>
-          <w:numId w:val="2"/>
+          <w:numId w:val="1"/>
         </w:numPr>
         <w:spacing w:after="100"/>
       </w:pPr>
@@ -18718,7 +18684,7 @@
         <w:pStyle w:val="ListParagraph"/>
         <w:numPr>
           <w:ilvl w:val="0"/>
-          <w:numId w:val="2"/>
+          <w:numId w:val="1"/>
         </w:numPr>
         <w:spacing w:after="100"/>
       </w:pPr>
@@ -18805,7 +18771,7 @@
         <w:pStyle w:val="ListParagraph"/>
         <w:numPr>
           <w:ilvl w:val="0"/>
-          <w:numId w:val="2"/>
+          <w:numId w:val="1"/>
         </w:numPr>
         <w:spacing w:after="100"/>
       </w:pPr>
@@ -18825,7 +18791,7 @@
         <w:pStyle w:val="ListParagraph"/>
         <w:numPr>
           <w:ilvl w:val="0"/>
-          <w:numId w:val="2"/>
+          <w:numId w:val="1"/>
         </w:numPr>
         <w:spacing w:after="100"/>
       </w:pPr>
@@ -18845,7 +18811,7 @@
         <w:pStyle w:val="ListParagraph"/>
         <w:numPr>
           <w:ilvl w:val="0"/>
-          <w:numId w:val="2"/>
+          <w:numId w:val="1"/>
         </w:numPr>
         <w:spacing w:after="100"/>
       </w:pPr>
@@ -18900,7 +18866,7 @@
         <w:pStyle w:val="ListParagraph"/>
         <w:numPr>
           <w:ilvl w:val="0"/>
-          <w:numId w:val="2"/>
+          <w:numId w:val="1"/>
         </w:numPr>
         <w:spacing w:after="100"/>
       </w:pPr>
@@ -18920,7 +18886,7 @@
         <w:pStyle w:val="ListParagraph"/>
         <w:numPr>
           <w:ilvl w:val="0"/>
-          <w:numId w:val="2"/>
+          <w:numId w:val="1"/>
         </w:numPr>
         <w:spacing w:after="100"/>
       </w:pPr>
@@ -18975,7 +18941,7 @@
         <w:pStyle w:val="ListParagraph"/>
         <w:numPr>
           <w:ilvl w:val="0"/>
-          <w:numId w:val="2"/>
+          <w:numId w:val="1"/>
         </w:numPr>
         <w:spacing w:after="100"/>
       </w:pPr>
@@ -18999,7 +18965,7 @@
         <w:pStyle w:val="ListParagraph"/>
         <w:numPr>
           <w:ilvl w:val="0"/>
-          <w:numId w:val="2"/>
+          <w:numId w:val="1"/>
         </w:numPr>
         <w:spacing w:after="100"/>
       </w:pPr>
@@ -19272,92 +19238,6 @@
 <file path=word/numbering.xml><?xml version="1.0" encoding="utf-8"?>
 <w:numbering xmlns:wpc="http://schemas.microsoft.com/office/word/2010/wordprocessingCanvas" xmlns:cx="http://schemas.microsoft.com/office/drawing/2014/chartex" xmlns:cx1="http://schemas.microsoft.com/office/drawing/2015/9/8/chartex" xmlns:cx2="http://schemas.microsoft.com/office/drawing/2015/10/21/chartex" xmlns:cx3="http://schemas.microsoft.com/office/drawing/2016/5/9/chartex" xmlns:cx4="http://schemas.microsoft.com/office/drawing/2016/5/10/chartex" xmlns:cx5="http://schemas.microsoft.com/office/drawing/2016/5/11/chartex" xmlns:cx6="http://schemas.microsoft.com/office/drawing/2016/5/12/chartex" xmlns:cx7="http://schemas.microsoft.com/office/drawing/2016/5/13/chartex" xmlns:cx8="http://schemas.microsoft.com/office/drawing/2016/5/14/chartex" xmlns:mc="http://schemas.openxmlformats.org/markup-compatibility/2006" xmlns:aink="http://schemas.microsoft.com/office/drawing/2016/ink" xmlns:am3d="http://schemas.microsoft.com/office/drawing/2017/model3d" xmlns:o="urn:schemas-microsoft-com:office:office" xmlns:r="http://schemas.openxmlformats.org/officeDocument/2006/relationships" xmlns:m="http://schemas.openxmlformats.org/officeDocument/2006/math" xmlns:v="urn:schemas-microsoft-com:vml" xmlns:wp14="http://schemas.microsoft.com/office/word/2010/wordprocessingDrawing" xmlns:wp="http://schemas.openxmlformats.org/drawingml/2006/wordprocessingDrawing" xmlns:w10="urn:schemas-microsoft-com:office:word" xmlns:w="http://schemas.openxmlformats.org/wordprocessingml/2006/main" xmlns:w14="http://schemas.microsoft.com/office/word/2010/wordml" xmlns:w15="http://schemas.microsoft.com/office/word/2012/wordml" xmlns:w16cex="http://schemas.microsoft.com/office/word/2018/wordml/cex" xmlns:w16cid="http://schemas.microsoft.com/office/word/2016/wordml/cid" xmlns:w16="http://schemas.microsoft.com/office/word/2018/wordml" xmlns:w16sdtdh="http://schemas.microsoft.com/office/word/2020/wordml/sdtdatahash" xmlns:w16se="http://schemas.microsoft.com/office/word/2015/wordml/symex" xmlns:wpg="http://schemas.microsoft.com/office/word/2010/wordprocessingGroup" xmlns:wpi="http://schemas.microsoft.com/office/word/2010/wordprocessingInk" xmlns:wne="http://schemas.microsoft.com/office/word/2006/wordml" xmlns:wps="http://schemas.microsoft.com/office/word/2010/wordprocessingShape" mc:Ignorable="w14 w15 w16se w16cid w16 w16cex w16sdtdh wp14">
   <w:abstractNum w:abstractNumId="0" w15:restartNumberingAfterBreak="0">
-    <w:nsid w:val="028965C1"/>
-    <w:multiLevelType w:val="hybridMultilevel"/>
-    <w:tmpl w:val="C90435B6"/>
-    <w:lvl w:ilvl="0" w:tplc="EE90ABD0">
-      <w:start w:val="1"/>
-      <w:numFmt w:val="bullet"/>
-      <w:lvlText w:val="●"/>
-      <w:lvlJc w:val="left"/>
-      <w:pPr>
-        <w:ind w:left="720" w:hanging="360"/>
-      </w:pPr>
-    </w:lvl>
-    <w:lvl w:ilvl="1" w:tplc="E530F616">
-      <w:start w:val="1"/>
-      <w:numFmt w:val="bullet"/>
-      <w:lvlText w:val="○"/>
-      <w:lvlJc w:val="left"/>
-      <w:pPr>
-        <w:ind w:left="1440" w:hanging="360"/>
-      </w:pPr>
-    </w:lvl>
-    <w:lvl w:ilvl="2" w:tplc="368846DA">
-      <w:start w:val="1"/>
-      <w:numFmt w:val="bullet"/>
-      <w:lvlText w:val="■"/>
-      <w:lvlJc w:val="left"/>
-      <w:pPr>
-        <w:ind w:left="2160" w:hanging="360"/>
-      </w:pPr>
-    </w:lvl>
-    <w:lvl w:ilvl="3" w:tplc="67222252">
-      <w:start w:val="1"/>
-      <w:numFmt w:val="bullet"/>
-      <w:lvlText w:val="●"/>
-      <w:lvlJc w:val="left"/>
-      <w:pPr>
-        <w:ind w:left="2880" w:hanging="360"/>
-      </w:pPr>
-    </w:lvl>
-    <w:lvl w:ilvl="4" w:tplc="1C6837AA">
-      <w:start w:val="1"/>
-      <w:numFmt w:val="bullet"/>
-      <w:lvlText w:val="○"/>
-      <w:lvlJc w:val="left"/>
-      <w:pPr>
-        <w:ind w:left="3600" w:hanging="360"/>
-      </w:pPr>
-    </w:lvl>
-    <w:lvl w:ilvl="5" w:tplc="CBC26EE8">
-      <w:start w:val="1"/>
-      <w:numFmt w:val="bullet"/>
-      <w:lvlText w:val="■"/>
-      <w:lvlJc w:val="left"/>
-      <w:pPr>
-        <w:ind w:left="4320" w:hanging="360"/>
-      </w:pPr>
-    </w:lvl>
-    <w:lvl w:ilvl="6" w:tplc="500E94A0">
-      <w:start w:val="1"/>
-      <w:numFmt w:val="bullet"/>
-      <w:lvlText w:val="●"/>
-      <w:lvlJc w:val="left"/>
-      <w:pPr>
-        <w:ind w:left="5040" w:hanging="360"/>
-      </w:pPr>
-    </w:lvl>
-    <w:lvl w:ilvl="7" w:tplc="2D8A64CA">
-      <w:start w:val="1"/>
-      <w:numFmt w:val="bullet"/>
-      <w:lvlText w:val="●"/>
-      <w:lvlJc w:val="left"/>
-      <w:pPr>
-        <w:ind w:left="5760" w:hanging="360"/>
-      </w:pPr>
-    </w:lvl>
-    <w:lvl w:ilvl="8" w:tplc="F1B8E60A">
-      <w:start w:val="1"/>
-      <w:numFmt w:val="bullet"/>
-      <w:lvlText w:val="●"/>
-      <w:lvlJc w:val="left"/>
-      <w:pPr>
-        <w:ind w:left="6480" w:hanging="360"/>
-      </w:pPr>
-    </w:lvl>
-  </w:abstractNum>
-  <w:abstractNum w:abstractNumId="1" w15:restartNumberingAfterBreak="0">
     <w:nsid w:val="048E7CD5"/>
     <w:multiLevelType w:val="hybridMultilevel"/>
     <w:tmpl w:val="986C0EF2"/>
@@ -19470,7 +19350,7 @@
       </w:rPr>
     </w:lvl>
   </w:abstractNum>
-  <w:abstractNum w:abstractNumId="2" w15:restartNumberingAfterBreak="0">
+  <w:abstractNum w:abstractNumId="1" w15:restartNumberingAfterBreak="0">
     <w:nsid w:val="063F5FD8"/>
     <w:multiLevelType w:val="hybridMultilevel"/>
     <w:tmpl w:val="72A81582"/>
@@ -19582,7 +19462,7 @@
       </w:rPr>
     </w:lvl>
   </w:abstractNum>
-  <w:abstractNum w:abstractNumId="3" w15:restartNumberingAfterBreak="0">
+  <w:abstractNum w:abstractNumId="2" w15:restartNumberingAfterBreak="0">
     <w:nsid w:val="102C1D4A"/>
     <w:multiLevelType w:val="multilevel"/>
     <w:tmpl w:val="9FF619B4"/>
@@ -19730,7 +19610,7 @@
       </w:rPr>
     </w:lvl>
   </w:abstractNum>
-  <w:abstractNum w:abstractNumId="4" w15:restartNumberingAfterBreak="0">
+  <w:abstractNum w:abstractNumId="3" w15:restartNumberingAfterBreak="0">
     <w:nsid w:val="10AE24A5"/>
     <w:multiLevelType w:val="hybridMultilevel"/>
     <w:tmpl w:val="1DDAAF6C"/>
@@ -19816,96 +19696,7 @@
       </w:pPr>
     </w:lvl>
   </w:abstractNum>
-  <w:abstractNum w:abstractNumId="5" w15:restartNumberingAfterBreak="0">
-    <w:nsid w:val="10EC5B30"/>
-    <w:multiLevelType w:val="hybridMultilevel"/>
-    <w:tmpl w:val="F38040EA"/>
-    <w:lvl w:ilvl="0" w:tplc="0409000F">
-      <w:start w:val="7"/>
-      <w:numFmt w:val="decimal"/>
-      <w:lvlText w:val="%1."/>
-      <w:lvlJc w:val="left"/>
-      <w:pPr>
-        <w:ind w:left="720" w:hanging="360"/>
-      </w:pPr>
-      <w:rPr>
-        <w:rFonts w:hint="default"/>
-      </w:rPr>
-    </w:lvl>
-    <w:lvl w:ilvl="1" w:tplc="04090019" w:tentative="1">
-      <w:start w:val="1"/>
-      <w:numFmt w:val="lowerLetter"/>
-      <w:lvlText w:val="%2."/>
-      <w:lvlJc w:val="left"/>
-      <w:pPr>
-        <w:ind w:left="1440" w:hanging="360"/>
-      </w:pPr>
-    </w:lvl>
-    <w:lvl w:ilvl="2" w:tplc="0409001B" w:tentative="1">
-      <w:start w:val="1"/>
-      <w:numFmt w:val="lowerRoman"/>
-      <w:lvlText w:val="%3."/>
-      <w:lvlJc w:val="right"/>
-      <w:pPr>
-        <w:ind w:left="2160" w:hanging="180"/>
-      </w:pPr>
-    </w:lvl>
-    <w:lvl w:ilvl="3" w:tplc="0409000F" w:tentative="1">
-      <w:start w:val="1"/>
-      <w:numFmt w:val="decimal"/>
-      <w:lvlText w:val="%4."/>
-      <w:lvlJc w:val="left"/>
-      <w:pPr>
-        <w:ind w:left="2880" w:hanging="360"/>
-      </w:pPr>
-    </w:lvl>
-    <w:lvl w:ilvl="4" w:tplc="04090019" w:tentative="1">
-      <w:start w:val="1"/>
-      <w:numFmt w:val="lowerLetter"/>
-      <w:lvlText w:val="%5."/>
-      <w:lvlJc w:val="left"/>
-      <w:pPr>
-        <w:ind w:left="3600" w:hanging="360"/>
-      </w:pPr>
-    </w:lvl>
-    <w:lvl w:ilvl="5" w:tplc="0409001B" w:tentative="1">
-      <w:start w:val="1"/>
-      <w:numFmt w:val="lowerRoman"/>
-      <w:lvlText w:val="%6."/>
-      <w:lvlJc w:val="right"/>
-      <w:pPr>
-        <w:ind w:left="4320" w:hanging="180"/>
-      </w:pPr>
-    </w:lvl>
-    <w:lvl w:ilvl="6" w:tplc="0409000F" w:tentative="1">
-      <w:start w:val="1"/>
-      <w:numFmt w:val="decimal"/>
-      <w:lvlText w:val="%7."/>
-      <w:lvlJc w:val="left"/>
-      <w:pPr>
-        <w:ind w:left="5040" w:hanging="360"/>
-      </w:pPr>
-    </w:lvl>
-    <w:lvl w:ilvl="7" w:tplc="04090019" w:tentative="1">
-      <w:start w:val="1"/>
-      <w:numFmt w:val="lowerLetter"/>
-      <w:lvlText w:val="%8."/>
-      <w:lvlJc w:val="left"/>
-      <w:pPr>
-        <w:ind w:left="5760" w:hanging="360"/>
-      </w:pPr>
-    </w:lvl>
-    <w:lvl w:ilvl="8" w:tplc="0409001B" w:tentative="1">
-      <w:start w:val="1"/>
-      <w:numFmt w:val="lowerRoman"/>
-      <w:lvlText w:val="%9."/>
-      <w:lvlJc w:val="right"/>
-      <w:pPr>
-        <w:ind w:left="6480" w:hanging="180"/>
-      </w:pPr>
-    </w:lvl>
-  </w:abstractNum>
-  <w:abstractNum w:abstractNumId="6" w15:restartNumberingAfterBreak="0">
+  <w:abstractNum w:abstractNumId="4" w15:restartNumberingAfterBreak="0">
     <w:nsid w:val="1266087B"/>
     <w:multiLevelType w:val="hybridMultilevel"/>
     <w:tmpl w:val="FF32BC6C"/>
@@ -20017,7 +19808,7 @@
       </w:rPr>
     </w:lvl>
   </w:abstractNum>
-  <w:abstractNum w:abstractNumId="7" w15:restartNumberingAfterBreak="0">
+  <w:abstractNum w:abstractNumId="5" w15:restartNumberingAfterBreak="0">
     <w:nsid w:val="15894EB4"/>
     <w:multiLevelType w:val="hybridMultilevel"/>
     <w:tmpl w:val="212AC350"/>
@@ -20129,93 +19920,7 @@
       </w:rPr>
     </w:lvl>
   </w:abstractNum>
-  <w:abstractNum w:abstractNumId="8" w15:restartNumberingAfterBreak="0">
-    <w:nsid w:val="1C581060"/>
-    <w:multiLevelType w:val="hybridMultilevel"/>
-    <w:tmpl w:val="D4182260"/>
-    <w:lvl w:ilvl="0" w:tplc="0409000F">
-      <w:start w:val="1"/>
-      <w:numFmt w:val="decimal"/>
-      <w:lvlText w:val="%1."/>
-      <w:lvlJc w:val="left"/>
-      <w:pPr>
-        <w:ind w:left="720" w:hanging="360"/>
-      </w:pPr>
-    </w:lvl>
-    <w:lvl w:ilvl="1" w:tplc="04090019" w:tentative="1">
-      <w:start w:val="1"/>
-      <w:numFmt w:val="lowerLetter"/>
-      <w:lvlText w:val="%2."/>
-      <w:lvlJc w:val="left"/>
-      <w:pPr>
-        <w:ind w:left="1440" w:hanging="360"/>
-      </w:pPr>
-    </w:lvl>
-    <w:lvl w:ilvl="2" w:tplc="0409001B" w:tentative="1">
-      <w:start w:val="1"/>
-      <w:numFmt w:val="lowerRoman"/>
-      <w:lvlText w:val="%3."/>
-      <w:lvlJc w:val="right"/>
-      <w:pPr>
-        <w:ind w:left="2160" w:hanging="180"/>
-      </w:pPr>
-    </w:lvl>
-    <w:lvl w:ilvl="3" w:tplc="0409000F" w:tentative="1">
-      <w:start w:val="1"/>
-      <w:numFmt w:val="decimal"/>
-      <w:lvlText w:val="%4."/>
-      <w:lvlJc w:val="left"/>
-      <w:pPr>
-        <w:ind w:left="2880" w:hanging="360"/>
-      </w:pPr>
-    </w:lvl>
-    <w:lvl w:ilvl="4" w:tplc="04090019" w:tentative="1">
-      <w:start w:val="1"/>
-      <w:numFmt w:val="lowerLetter"/>
-      <w:lvlText w:val="%5."/>
-      <w:lvlJc w:val="left"/>
-      <w:pPr>
-        <w:ind w:left="3600" w:hanging="360"/>
-      </w:pPr>
-    </w:lvl>
-    <w:lvl w:ilvl="5" w:tplc="0409001B" w:tentative="1">
-      <w:start w:val="1"/>
-      <w:numFmt w:val="lowerRoman"/>
-      <w:lvlText w:val="%6."/>
-      <w:lvlJc w:val="right"/>
-      <w:pPr>
-        <w:ind w:left="4320" w:hanging="180"/>
-      </w:pPr>
-    </w:lvl>
-    <w:lvl w:ilvl="6" w:tplc="0409000F" w:tentative="1">
-      <w:start w:val="1"/>
-      <w:numFmt w:val="decimal"/>
-      <w:lvlText w:val="%7."/>
-      <w:lvlJc w:val="left"/>
-      <w:pPr>
-        <w:ind w:left="5040" w:hanging="360"/>
-      </w:pPr>
-    </w:lvl>
-    <w:lvl w:ilvl="7" w:tplc="04090019" w:tentative="1">
-      <w:start w:val="1"/>
-      <w:numFmt w:val="lowerLetter"/>
-      <w:lvlText w:val="%8."/>
-      <w:lvlJc w:val="left"/>
-      <w:pPr>
-        <w:ind w:left="5760" w:hanging="360"/>
-      </w:pPr>
-    </w:lvl>
-    <w:lvl w:ilvl="8" w:tplc="0409001B" w:tentative="1">
-      <w:start w:val="1"/>
-      <w:numFmt w:val="lowerRoman"/>
-      <w:lvlText w:val="%9."/>
-      <w:lvlJc w:val="right"/>
-      <w:pPr>
-        <w:ind w:left="6480" w:hanging="180"/>
-      </w:pPr>
-    </w:lvl>
-  </w:abstractNum>
-  <w:abstractNum w:abstractNumId="9" w15:restartNumberingAfterBreak="0">
+  <w:abstractNum w:abstractNumId="6" w15:restartNumberingAfterBreak="0">
     <w:nsid w:val="1D8070BF"/>
     <w:multiLevelType w:val="hybridMultilevel"/>
     <w:tmpl w:val="6150BDA0"/>
@@ -20328,212 +20033,7 @@
       </w:rPr>
     </w:lvl>
   </w:abstractNum>
-  <w:abstractNum w:abstractNumId="10" w15:restartNumberingAfterBreak="0">
-    <w:nsid w:val="1DB6731B"/>
-    <w:multiLevelType w:val="hybridMultilevel"/>
-    <w:tmpl w:val="4D20164C"/>
-    <w:lvl w:ilvl="0" w:tplc="04090001">
-      <w:start w:val="1"/>
-      <w:numFmt w:val="bullet"/>
-      <w:lvlText w:val=""/>
-      <w:lvlJc w:val="left"/>
-      <w:pPr>
-        <w:ind w:left="720" w:hanging="360"/>
-      </w:pPr>
-      <w:rPr>
-        <w:rFonts w:ascii="Symbol" w:hAnsi="Symbol" w:hint="default"/>
-      </w:rPr>
-    </w:lvl>
-    <w:lvl w:ilvl="1" w:tplc="04090003" w:tentative="1">
-      <w:start w:val="1"/>
-      <w:numFmt w:val="bullet"/>
-      <w:lvlText w:val="o"/>
-      <w:lvlJc w:val="left"/>
-      <w:pPr>
-        <w:ind w:left="1440" w:hanging="360"/>
-      </w:pPr>
-      <w:rPr>
-        <w:rFonts w:ascii="Courier New" w:hAnsi="Courier New" w:cs="Courier New" w:hint="default"/>
-      </w:rPr>
-    </w:lvl>
-    <w:lvl w:ilvl="2" w:tplc="04090005" w:tentative="1">
-      <w:start w:val="1"/>
-      <w:numFmt w:val="bullet"/>
-      <w:lvlText w:val=""/>
-      <w:lvlJc w:val="left"/>
-      <w:pPr>
-        <w:ind w:left="2160" w:hanging="360"/>
-      </w:pPr>
-      <w:rPr>
-        <w:rFonts w:ascii="Wingdings" w:hAnsi="Wingdings" w:hint="default"/>
-      </w:rPr>
-    </w:lvl>
-    <w:lvl w:ilvl="3" w:tplc="04090001" w:tentative="1">
-      <w:start w:val="1"/>
-      <w:numFmt w:val="bullet"/>
-      <w:lvlText w:val=""/>
-      <w:lvlJc w:val="left"/>
-      <w:pPr>
-        <w:ind w:left="2880" w:hanging="360"/>
-      </w:pPr>
-      <w:rPr>
-        <w:rFonts w:ascii="Symbol" w:hAnsi="Symbol" w:hint="default"/>
-      </w:rPr>
-    </w:lvl>
-    <w:lvl w:ilvl="4" w:tplc="04090003" w:tentative="1">
-      <w:start w:val="1"/>
-      <w:numFmt w:val="bullet"/>
-      <w:lvlText w:val="o"/>
-      <w:lvlJc w:val="left"/>
-      <w:pPr>
-        <w:ind w:left="3600" w:hanging="360"/>
-      </w:pPr>
-      <w:rPr>
-        <w:rFonts w:ascii="Courier New" w:hAnsi="Courier New" w:cs="Courier New" w:hint="default"/>
-      </w:rPr>
-    </w:lvl>
-    <w:lvl w:ilvl="5" w:tplc="04090005" w:tentative="1">
-      <w:start w:val="1"/>
-      <w:numFmt w:val="bullet"/>
-      <w:lvlText w:val=""/>
-      <w:lvlJc w:val="left"/>
-      <w:pPr>
-        <w:ind w:left="4320" w:hanging="360"/>
-      </w:pPr>
-      <w:rPr>
-        <w:rFonts w:ascii="Wingdings" w:hAnsi="Wingdings" w:hint="default"/>
-      </w:rPr>
-    </w:lvl>
-    <w:lvl w:ilvl="6" w:tplc="04090001" w:tentative="1">
-      <w:start w:val="1"/>
-      <w:numFmt w:val="bullet"/>
-      <w:lvlText w:val=""/>
-      <w:lvlJc w:val="left"/>
-      <w:pPr>
-        <w:ind w:left="5040" w:hanging="360"/>
-      </w:pPr>
-      <w:rPr>
-        <w:rFonts w:ascii="Symbol" w:hAnsi="Symbol" w:hint="default"/>
-      </w:rPr>
-    </w:lvl>
-    <w:lvl w:ilvl="7" w:tplc="04090003" w:tentative="1">
-      <w:start w:val="1"/>
-      <w:numFmt w:val="bullet"/>
-      <w:lvlText w:val="o"/>
-      <w:lvlJc w:val="left"/>
-      <w:pPr>
-        <w:ind w:left="5760" w:hanging="360"/>
-      </w:pPr>
-      <w:rPr>
-        <w:rFonts w:ascii="Courier New" w:hAnsi="Courier New" w:cs="Courier New" w:hint="default"/>
-      </w:rPr>
-    </w:lvl>
-    <w:lvl w:ilvl="8" w:tplc="04090005" w:tentative="1">
-      <w:start w:val="1"/>
-      <w:numFmt w:val="bullet"/>
-      <w:lvlText w:val=""/>
-      <w:lvlJc w:val="left"/>
-      <w:pPr>
-        <w:ind w:left="6480" w:hanging="360"/>
-      </w:pPr>
-      <w:rPr>
-        <w:rFonts w:ascii="Wingdings" w:hAnsi="Wingdings" w:hint="default"/>
-      </w:rPr>
-    </w:lvl>
-  </w:abstractNum>
-  <w:abstractNum w:abstractNumId="11" w15:restartNumberingAfterBreak="0">
-    <w:nsid w:val="249E76BF"/>
-    <w:multiLevelType w:val="hybridMultilevel"/>
-    <w:tmpl w:val="071AB672"/>
-    <w:lvl w:ilvl="0" w:tplc="B150D2F2">
-      <w:start w:val="7"/>
-      <w:numFmt w:val="decimal"/>
-      <w:lvlText w:val="%1."/>
-      <w:lvlJc w:val="left"/>
-      <w:pPr>
-        <w:ind w:left="720" w:hanging="360"/>
-      </w:pPr>
-      <w:rPr>
-        <w:rFonts w:hint="default"/>
-        <w:b/>
-        <w:color w:val="000000"/>
-        <w:sz w:val="26"/>
-      </w:rPr>
-    </w:lvl>
-    <w:lvl w:ilvl="1" w:tplc="04090019" w:tentative="1">
-      <w:start w:val="1"/>
-      <w:numFmt w:val="lowerLetter"/>
-      <w:lvlText w:val="%2."/>
-      <w:lvlJc w:val="left"/>
-      <w:pPr>
-        <w:ind w:left="1440" w:hanging="360"/>
-      </w:pPr>
-    </w:lvl>
-    <w:lvl w:ilvl="2" w:tplc="0409001B" w:tentative="1">
-      <w:start w:val="1"/>
-      <w:numFmt w:val="lowerRoman"/>
-      <w:lvlText w:val="%3."/>
-      <w:lvlJc w:val="right"/>
-      <w:pPr>
-        <w:ind w:left="2160" w:hanging="180"/>
-      </w:pPr>
-    </w:lvl>
-    <w:lvl w:ilvl="3" w:tplc="0409000F" w:tentative="1">
-      <w:start w:val="1"/>
-      <w:numFmt w:val="decimal"/>
-      <w:lvlText w:val="%4."/>
-      <w:lvlJc w:val="left"/>
-      <w:pPr>
-        <w:ind w:left="2880" w:hanging="360"/>
-      </w:pPr>
-    </w:lvl>
-    <w:lvl w:ilvl="4" w:tplc="04090019" w:tentative="1">
-      <w:start w:val="1"/>
-      <w:numFmt w:val="lowerLetter"/>
-      <w:lvlText w:val="%5."/>
-      <w:lvlJc w:val="left"/>
-      <w:pPr>
-        <w:ind w:left="3600" w:hanging="360"/>
-      </w:pPr>
-    </w:lvl>
-    <w:lvl w:ilvl="5" w:tplc="0409001B" w:tentative="1">
-      <w:start w:val="1"/>
-      <w:numFmt w:val="lowerRoman"/>
-      <w:lvlText w:val="%6."/>
-      <w:lvlJc w:val="right"/>
-      <w:pPr>
-        <w:ind w:left="4320" w:hanging="180"/>
-      </w:pPr>
-    </w:lvl>
-    <w:lvl w:ilvl="6" w:tplc="0409000F" w:tentative="1">
-      <w:start w:val="1"/>
-      <w:numFmt w:val="decimal"/>
-      <w:lvlText w:val="%7."/>
-      <w:lvlJc w:val="left"/>
-      <w:pPr>
-        <w:ind w:left="5040" w:hanging="360"/>
-      </w:pPr>
-    </w:lvl>
-    <w:lvl w:ilvl="7" w:tplc="04090019" w:tentative="1">
-      <w:start w:val="1"/>
-      <w:numFmt w:val="lowerLetter"/>
-      <w:lvlText w:val="%8."/>
-      <w:lvlJc w:val="left"/>
-      <w:pPr>
-        <w:ind w:left="5760" w:hanging="360"/>
-      </w:pPr>
-    </w:lvl>
-    <w:lvl w:ilvl="8" w:tplc="0409001B" w:tentative="1">
-      <w:start w:val="1"/>
-      <w:numFmt w:val="lowerRoman"/>
-      <w:lvlText w:val="%9."/>
-      <w:lvlJc w:val="right"/>
-      <w:pPr>
-        <w:ind w:left="6480" w:hanging="180"/>
-      </w:pPr>
-    </w:lvl>
-  </w:abstractNum>
-  <w:abstractNum w:abstractNumId="12" w15:restartNumberingAfterBreak="0">
+  <w:abstractNum w:abstractNumId="7" w15:restartNumberingAfterBreak="0">
     <w:nsid w:val="24F2167E"/>
     <w:multiLevelType w:val="hybridMultilevel"/>
     <w:tmpl w:val="05CEF50A"/>
@@ -20646,7 +20146,7 @@
       </w:rPr>
     </w:lvl>
   </w:abstractNum>
-  <w:abstractNum w:abstractNumId="13" w15:restartNumberingAfterBreak="0">
+  <w:abstractNum w:abstractNumId="8" w15:restartNumberingAfterBreak="0">
     <w:nsid w:val="2A17698A"/>
     <w:multiLevelType w:val="hybridMultilevel"/>
     <w:tmpl w:val="438A58A2"/>
@@ -20758,93 +20258,7 @@
       </w:rPr>
     </w:lvl>
   </w:abstractNum>
-  <w:abstractNum w:abstractNumId="14" w15:restartNumberingAfterBreak="0">
-    <w:nsid w:val="2A424EC5"/>
-    <w:multiLevelType w:val="hybridMultilevel"/>
-    <w:tmpl w:val="3B26782A"/>
-    <w:lvl w:ilvl="0" w:tplc="0409000F">
-      <w:start w:val="1"/>
-      <w:numFmt w:val="decimal"/>
-      <w:lvlText w:val="%1."/>
-      <w:lvlJc w:val="left"/>
-      <w:pPr>
-        <w:ind w:left="720" w:hanging="360"/>
-      </w:pPr>
-    </w:lvl>
-    <w:lvl w:ilvl="1" w:tplc="04090019" w:tentative="1">
-      <w:start w:val="1"/>
-      <w:numFmt w:val="lowerLetter"/>
-      <w:lvlText w:val="%2."/>
-      <w:lvlJc w:val="left"/>
-      <w:pPr>
-        <w:ind w:left="1440" w:hanging="360"/>
-      </w:pPr>
-    </w:lvl>
-    <w:lvl w:ilvl="2" w:tplc="0409001B" w:tentative="1">
-      <w:start w:val="1"/>
-      <w:numFmt w:val="lowerRoman"/>
-      <w:lvlText w:val="%3."/>
-      <w:lvlJc w:val="right"/>
-      <w:pPr>
-        <w:ind w:left="2160" w:hanging="180"/>
-      </w:pPr>
-    </w:lvl>
-    <w:lvl w:ilvl="3" w:tplc="0409000F" w:tentative="1">
-      <w:start w:val="1"/>
-      <w:numFmt w:val="decimal"/>
-      <w:lvlText w:val="%4."/>
-      <w:lvlJc w:val="left"/>
-      <w:pPr>
-        <w:ind w:left="2880" w:hanging="360"/>
-      </w:pPr>
-    </w:lvl>
-    <w:lvl w:ilvl="4" w:tplc="04090019" w:tentative="1">
-      <w:start w:val="1"/>
-      <w:numFmt w:val="lowerLetter"/>
-      <w:lvlText w:val="%5."/>
-      <w:lvlJc w:val="left"/>
-      <w:pPr>
-        <w:ind w:left="3600" w:hanging="360"/>
-      </w:pPr>
-    </w:lvl>
-    <w:lvl w:ilvl="5" w:tplc="0409001B" w:tentative="1">
-      <w:start w:val="1"/>
-      <w:numFmt w:val="lowerRoman"/>
-      <w:lvlText w:val="%6."/>
-      <w:lvlJc w:val="right"/>
-      <w:pPr>
-        <w:ind w:left="4320" w:hanging="180"/>
-      </w:pPr>
-    </w:lvl>
-    <w:lvl w:ilvl="6" w:tplc="0409000F" w:tentative="1">
-      <w:start w:val="1"/>
-      <w:numFmt w:val="decimal"/>
-      <w:lvlText w:val="%7."/>
-      <w:lvlJc w:val="left"/>
-      <w:pPr>
-        <w:ind w:left="5040" w:hanging="360"/>
-      </w:pPr>
-    </w:lvl>
-    <w:lvl w:ilvl="7" w:tplc="04090019" w:tentative="1">
-      <w:start w:val="1"/>
-      <w:numFmt w:val="lowerLetter"/>
-      <w:lvlText w:val="%8."/>
-      <w:lvlJc w:val="left"/>
-      <w:pPr>
-        <w:ind w:left="5760" w:hanging="360"/>
-      </w:pPr>
-    </w:lvl>
-    <w:lvl w:ilvl="8" w:tplc="0409001B" w:tentative="1">
-      <w:start w:val="1"/>
-      <w:numFmt w:val="lowerRoman"/>
-      <w:lvlText w:val="%9."/>
-      <w:lvlJc w:val="right"/>
-      <w:pPr>
-        <w:ind w:left="6480" w:hanging="180"/>
-      </w:pPr>
-    </w:lvl>
-  </w:abstractNum>
-  <w:abstractNum w:abstractNumId="15" w15:restartNumberingAfterBreak="0">
+  <w:abstractNum w:abstractNumId="9" w15:restartNumberingAfterBreak="0">
     <w:nsid w:val="2BBC181D"/>
     <w:multiLevelType w:val="hybridMultilevel"/>
     <w:tmpl w:val="A5A8A410"/>
@@ -20930,7 +20344,7 @@
       </w:pPr>
     </w:lvl>
   </w:abstractNum>
-  <w:abstractNum w:abstractNumId="16" w15:restartNumberingAfterBreak="0">
+  <w:abstractNum w:abstractNumId="10" w15:restartNumberingAfterBreak="0">
     <w:nsid w:val="2C7949E4"/>
     <w:multiLevelType w:val="hybridMultilevel"/>
     <w:tmpl w:val="EF762898"/>
@@ -21016,247 +20430,7 @@
       </w:pPr>
     </w:lvl>
   </w:abstractNum>
-  <w:abstractNum w:abstractNumId="17" w15:restartNumberingAfterBreak="0">
-    <w:nsid w:val="2D8C0140"/>
-    <w:multiLevelType w:val="hybridMultilevel"/>
-    <w:tmpl w:val="2E12CC0A"/>
-    <w:lvl w:ilvl="0" w:tplc="9F007270">
-      <w:start w:val="1"/>
-      <w:numFmt w:val="decimal"/>
-      <w:lvlText w:val="%1."/>
-      <w:lvlJc w:val="left"/>
-      <w:pPr>
-        <w:ind w:left="720" w:hanging="360"/>
-      </w:pPr>
-      <w:rPr>
-        <w:rFonts w:hint="default"/>
-        <w:color w:val="000000"/>
-        <w:sz w:val="26"/>
-      </w:rPr>
-    </w:lvl>
-    <w:lvl w:ilvl="1" w:tplc="04090019" w:tentative="1">
-      <w:start w:val="1"/>
-      <w:numFmt w:val="lowerLetter"/>
-      <w:lvlText w:val="%2."/>
-      <w:lvlJc w:val="left"/>
-      <w:pPr>
-        <w:ind w:left="1440" w:hanging="360"/>
-      </w:pPr>
-    </w:lvl>
-    <w:lvl w:ilvl="2" w:tplc="0409001B" w:tentative="1">
-      <w:start w:val="1"/>
-      <w:numFmt w:val="lowerRoman"/>
-      <w:lvlText w:val="%3."/>
-      <w:lvlJc w:val="right"/>
-      <w:pPr>
-        <w:ind w:left="2160" w:hanging="180"/>
-      </w:pPr>
-    </w:lvl>
-    <w:lvl w:ilvl="3" w:tplc="0409000F" w:tentative="1">
-      <w:start w:val="1"/>
-      <w:numFmt w:val="decimal"/>
-      <w:lvlText w:val="%4."/>
-      <w:lvlJc w:val="left"/>
-      <w:pPr>
-        <w:ind w:left="2880" w:hanging="360"/>
-      </w:pPr>
-    </w:lvl>
-    <w:lvl w:ilvl="4" w:tplc="04090019" w:tentative="1">
-      <w:start w:val="1"/>
-      <w:numFmt w:val="lowerLetter"/>
-      <w:lvlText w:val="%5."/>
-      <w:lvlJc w:val="left"/>
-      <w:pPr>
-        <w:ind w:left="3600" w:hanging="360"/>
-      </w:pPr>
-    </w:lvl>
-    <w:lvl w:ilvl="5" w:tplc="0409001B" w:tentative="1">
-      <w:start w:val="1"/>
-      <w:numFmt w:val="lowerRoman"/>
-      <w:lvlText w:val="%6."/>
-      <w:lvlJc w:val="right"/>
-      <w:pPr>
-        <w:ind w:left="4320" w:hanging="180"/>
-      </w:pPr>
-    </w:lvl>
-    <w:lvl w:ilvl="6" w:tplc="0409000F" w:tentative="1">
-      <w:start w:val="1"/>
-      <w:numFmt w:val="decimal"/>
-      <w:lvlText w:val="%7."/>
-      <w:lvlJc w:val="left"/>
-      <w:pPr>
-        <w:ind w:left="5040" w:hanging="360"/>
-      </w:pPr>
-    </w:lvl>
-    <w:lvl w:ilvl="7" w:tplc="04090019" w:tentative="1">
-      <w:start w:val="1"/>
-      <w:numFmt w:val="lowerLetter"/>
-      <w:lvlText w:val="%8."/>
-      <w:lvlJc w:val="left"/>
-      <w:pPr>
-        <w:ind w:left="5760" w:hanging="360"/>
-      </w:pPr>
-    </w:lvl>
-    <w:lvl w:ilvl="8" w:tplc="0409001B" w:tentative="1">
-      <w:start w:val="1"/>
-      <w:numFmt w:val="lowerRoman"/>
-      <w:lvlText w:val="%9."/>
-      <w:lvlJc w:val="right"/>
-      <w:pPr>
-        <w:ind w:left="6480" w:hanging="180"/>
-      </w:pPr>
-    </w:lvl>
-  </w:abstractNum>
-  <w:abstractNum w:abstractNumId="18" w15:restartNumberingAfterBreak="0">
-    <w:nsid w:val="2F08739E"/>
-    <w:multiLevelType w:val="multilevel"/>
-    <w:tmpl w:val="38F09F84"/>
-    <w:lvl w:ilvl="0">
-      <w:start w:val="1"/>
-      <w:numFmt w:val="bullet"/>
-      <w:lvlText w:val=""/>
-      <w:lvlJc w:val="left"/>
-      <w:pPr>
-        <w:tabs>
-          <w:tab w:val="num" w:pos="720"/>
-        </w:tabs>
-        <w:ind w:left="720" w:hanging="360"/>
-      </w:pPr>
-      <w:rPr>
-        <w:rFonts w:ascii="Symbol" w:hAnsi="Symbol" w:hint="default"/>
-        <w:sz w:val="20"/>
-      </w:rPr>
-    </w:lvl>
-    <w:lvl w:ilvl="1" w:tentative="1">
-      <w:start w:val="1"/>
-      <w:numFmt w:val="bullet"/>
-      <w:lvlText w:val="o"/>
-      <w:lvlJc w:val="left"/>
-      <w:pPr>
-        <w:tabs>
-          <w:tab w:val="num" w:pos="1440"/>
-        </w:tabs>
-        <w:ind w:left="1440" w:hanging="360"/>
-      </w:pPr>
-      <w:rPr>
-        <w:rFonts w:ascii="Courier New" w:hAnsi="Courier New" w:hint="default"/>
-        <w:sz w:val="20"/>
-      </w:rPr>
-    </w:lvl>
-    <w:lvl w:ilvl="2" w:tentative="1">
-      <w:start w:val="1"/>
-      <w:numFmt w:val="bullet"/>
-      <w:lvlText w:val=""/>
-      <w:lvlJc w:val="left"/>
-      <w:pPr>
-        <w:tabs>
-          <w:tab w:val="num" w:pos="2160"/>
-        </w:tabs>
-        <w:ind w:left="2160" w:hanging="360"/>
-      </w:pPr>
-      <w:rPr>
-        <w:rFonts w:ascii="Wingdings" w:hAnsi="Wingdings" w:hint="default"/>
-        <w:sz w:val="20"/>
-      </w:rPr>
-    </w:lvl>
-    <w:lvl w:ilvl="3" w:tentative="1">
-      <w:start w:val="1"/>
-      <w:numFmt w:val="bullet"/>
-      <w:lvlText w:val=""/>
-      <w:lvlJc w:val="left"/>
-      <w:pPr>
-        <w:tabs>
-          <w:tab w:val="num" w:pos="2880"/>
-        </w:tabs>
-        <w:ind w:left="2880" w:hanging="360"/>
-      </w:pPr>
-      <w:rPr>
-        <w:rFonts w:ascii="Wingdings" w:hAnsi="Wingdings" w:hint="default"/>
-        <w:sz w:val="20"/>
-      </w:rPr>
-    </w:lvl>
-    <w:lvl w:ilvl="4" w:tentative="1">
-      <w:start w:val="1"/>
-      <w:numFmt w:val="bullet"/>
-      <w:lvlText w:val=""/>
-      <w:lvlJc w:val="left"/>
-      <w:pPr>
-        <w:tabs>
-          <w:tab w:val="num" w:pos="3600"/>
-        </w:tabs>
-        <w:ind w:left="3600" w:hanging="360"/>
-      </w:pPr>
-      <w:rPr>
-        <w:rFonts w:ascii="Wingdings" w:hAnsi="Wingdings" w:hint="default"/>
-        <w:sz w:val="20"/>
-      </w:rPr>
-    </w:lvl>
-    <w:lvl w:ilvl="5" w:tentative="1">
-      <w:start w:val="1"/>
-      <w:numFmt w:val="bullet"/>
-      <w:lvlText w:val=""/>
-      <w:lvlJc w:val="left"/>
-      <w:pPr>
-        <w:tabs>
-          <w:tab w:val="num" w:pos="4320"/>
-        </w:tabs>
-        <w:ind w:left="4320" w:hanging="360"/>
-      </w:pPr>
-      <w:rPr>
-        <w:rFonts w:ascii="Wingdings" w:hAnsi="Wingdings" w:hint="default"/>
-        <w:sz w:val="20"/>
-      </w:rPr>
-    </w:lvl>
-    <w:lvl w:ilvl="6" w:tentative="1">
-      <w:start w:val="1"/>
-      <w:numFmt w:val="bullet"/>
-      <w:lvlText w:val=""/>
-      <w:lvlJc w:val="left"/>
-      <w:pPr>
-        <w:tabs>
-          <w:tab w:val="num" w:pos="5040"/>
-        </w:tabs>
-        <w:ind w:left="5040" w:hanging="360"/>
-      </w:pPr>
-      <w:rPr>
-        <w:rFonts w:ascii="Wingdings" w:hAnsi="Wingdings" w:hint="default"/>
-        <w:sz w:val="20"/>
-      </w:rPr>
-    </w:lvl>
-    <w:lvl w:ilvl="7" w:tentative="1">
-      <w:start w:val="1"/>
-      <w:numFmt w:val="bullet"/>
-      <w:lvlText w:val=""/>
-      <w:lvlJc w:val="left"/>
-      <w:pPr>
-        <w:tabs>
-          <w:tab w:val="num" w:pos="5760"/>
-        </w:tabs>
-        <w:ind w:left="5760" w:hanging="360"/>
-      </w:pPr>
-      <w:rPr>
-        <w:rFonts w:ascii="Wingdings" w:hAnsi="Wingdings" w:hint="default"/>
-        <w:sz w:val="20"/>
-      </w:rPr>
-    </w:lvl>
-    <w:lvl w:ilvl="8" w:tentative="1">
-      <w:start w:val="1"/>
-      <w:numFmt w:val="bullet"/>
-      <w:lvlText w:val=""/>
-      <w:lvlJc w:val="left"/>
-      <w:pPr>
-        <w:tabs>
-          <w:tab w:val="num" w:pos="6480"/>
-        </w:tabs>
-        <w:ind w:left="6480" w:hanging="360"/>
-      </w:pPr>
-      <w:rPr>
-        <w:rFonts w:ascii="Wingdings" w:hAnsi="Wingdings" w:hint="default"/>
-        <w:sz w:val="20"/>
-      </w:rPr>
-    </w:lvl>
-  </w:abstractNum>
-  <w:abstractNum w:abstractNumId="19" w15:restartNumberingAfterBreak="0">
+  <w:abstractNum w:abstractNumId="11" w15:restartNumberingAfterBreak="0">
     <w:nsid w:val="2F481D7A"/>
     <w:multiLevelType w:val="hybridMultilevel"/>
     <w:tmpl w:val="21FC394E"/>
@@ -21369,7 +20543,7 @@
       </w:rPr>
     </w:lvl>
   </w:abstractNum>
-  <w:abstractNum w:abstractNumId="20" w15:restartNumberingAfterBreak="0">
+  <w:abstractNum w:abstractNumId="12" w15:restartNumberingAfterBreak="0">
     <w:nsid w:val="2F731194"/>
     <w:multiLevelType w:val="hybridMultilevel"/>
     <w:tmpl w:val="335E04CA"/>
@@ -21481,99 +20655,7 @@
       </w:rPr>
     </w:lvl>
   </w:abstractNum>
-  <w:abstractNum w:abstractNumId="21" w15:restartNumberingAfterBreak="0">
-    <w:nsid w:val="31A65A58"/>
-    <w:multiLevelType w:val="hybridMultilevel"/>
-    <w:tmpl w:val="6D82883A"/>
-    <w:lvl w:ilvl="0" w:tplc="B150D2F2">
-      <w:start w:val="7"/>
-      <w:numFmt w:val="decimal"/>
-      <w:lvlText w:val="%1."/>
-      <w:lvlJc w:val="left"/>
-      <w:pPr>
-        <w:ind w:left="1080" w:hanging="360"/>
-      </w:pPr>
-      <w:rPr>
-        <w:rFonts w:hint="default"/>
-        <w:b/>
-        <w:color w:val="000000"/>
-        <w:sz w:val="26"/>
-      </w:rPr>
-    </w:lvl>
-    <w:lvl w:ilvl="1" w:tplc="04090019" w:tentative="1">
-      <w:start w:val="1"/>
-      <w:numFmt w:val="lowerLetter"/>
-      <w:lvlText w:val="%2."/>
-      <w:lvlJc w:val="left"/>
-      <w:pPr>
-        <w:ind w:left="1800" w:hanging="360"/>
-      </w:pPr>
-    </w:lvl>
-    <w:lvl w:ilvl="2" w:tplc="0409001B" w:tentative="1">
-      <w:start w:val="1"/>
-      <w:numFmt w:val="lowerRoman"/>
-      <w:lvlText w:val="%3."/>
-      <w:lvlJc w:val="right"/>
-      <w:pPr>
-        <w:ind w:left="2520" w:hanging="180"/>
-      </w:pPr>
-    </w:lvl>
-    <w:lvl w:ilvl="3" w:tplc="0409000F" w:tentative="1">
-      <w:start w:val="1"/>
-      <w:numFmt w:val="decimal"/>
-      <w:lvlText w:val="%4."/>
-      <w:lvlJc w:val="left"/>
-      <w:pPr>
-        <w:ind w:left="3240" w:hanging="360"/>
-      </w:pPr>
-    </w:lvl>
-    <w:lvl w:ilvl="4" w:tplc="04090019" w:tentative="1">
-      <w:start w:val="1"/>
-      <w:numFmt w:val="lowerLetter"/>
-      <w:lvlText w:val="%5."/>
-      <w:lvlJc w:val="left"/>
-      <w:pPr>
-        <w:ind w:left="3960" w:hanging="360"/>
-      </w:pPr>
-    </w:lvl>
-    <w:lvl w:ilvl="5" w:tplc="0409001B" w:tentative="1">
-      <w:start w:val="1"/>
-      <w:numFmt w:val="lowerRoman"/>
-      <w:lvlText w:val="%6."/>
-      <w:lvlJc w:val="right"/>
-      <w:pPr>
-        <w:ind w:left="4680" w:hanging="180"/>
-      </w:pPr>
-    </w:lvl>
-    <w:lvl w:ilvl="6" w:tplc="0409000F" w:tentative="1">
-      <w:start w:val="1"/>
-      <w:numFmt w:val="decimal"/>
-      <w:lvlText w:val="%7."/>
-      <w:lvlJc w:val="left"/>
-      <w:pPr>
-        <w:ind w:left="5400" w:hanging="360"/>
-      </w:pPr>
-    </w:lvl>
-    <w:lvl w:ilvl="7" w:tplc="04090019" w:tentative="1">
-      <w:start w:val="1"/>
-      <w:numFmt w:val="lowerLetter"/>
-      <w:lvlText w:val="%8."/>
-      <w:lvlJc w:val="left"/>
-      <w:pPr>
-        <w:ind w:left="6120" w:hanging="360"/>
-      </w:pPr>
-    </w:lvl>
-    <w:lvl w:ilvl="8" w:tplc="0409001B" w:tentative="1">
-      <w:start w:val="1"/>
-      <w:numFmt w:val="lowerRoman"/>
-      <w:lvlText w:val="%9."/>
-      <w:lvlJc w:val="right"/>
-      <w:pPr>
-        <w:ind w:left="6840" w:hanging="180"/>
-      </w:pPr>
-    </w:lvl>
-  </w:abstractNum>
-  <w:abstractNum w:abstractNumId="22" w15:restartNumberingAfterBreak="0">
+  <w:abstractNum w:abstractNumId="13" w15:restartNumberingAfterBreak="0">
     <w:nsid w:val="33562FA4"/>
     <w:multiLevelType w:val="hybridMultilevel"/>
     <w:tmpl w:val="C9B48BC8"/>
@@ -21686,7 +20768,7 @@
       </w:rPr>
     </w:lvl>
   </w:abstractNum>
-  <w:abstractNum w:abstractNumId="23" w15:restartNumberingAfterBreak="0">
+  <w:abstractNum w:abstractNumId="14" w15:restartNumberingAfterBreak="0">
     <w:nsid w:val="33E4671B"/>
     <w:multiLevelType w:val="hybridMultilevel"/>
     <w:tmpl w:val="623AEA94"/>
@@ -21799,93 +20881,7 @@
       </w:rPr>
     </w:lvl>
   </w:abstractNum>
-  <w:abstractNum w:abstractNumId="24" w15:restartNumberingAfterBreak="0">
-    <w:nsid w:val="35C87455"/>
-    <w:multiLevelType w:val="hybridMultilevel"/>
-    <w:tmpl w:val="87DA365E"/>
-    <w:lvl w:ilvl="0" w:tplc="0409000F">
-      <w:start w:val="1"/>
-      <w:numFmt w:val="decimal"/>
-      <w:lvlText w:val="%1."/>
-      <w:lvlJc w:val="left"/>
-      <w:pPr>
-        <w:ind w:left="720" w:hanging="360"/>
-      </w:pPr>
-    </w:lvl>
-    <w:lvl w:ilvl="1" w:tplc="04090019" w:tentative="1">
-      <w:start w:val="1"/>
-      <w:numFmt w:val="lowerLetter"/>
-      <w:lvlText w:val="%2."/>
-      <w:lvlJc w:val="left"/>
-      <w:pPr>
-        <w:ind w:left="1440" w:hanging="360"/>
-      </w:pPr>
-    </w:lvl>
-    <w:lvl w:ilvl="2" w:tplc="0409001B" w:tentative="1">
-      <w:start w:val="1"/>
-      <w:numFmt w:val="lowerRoman"/>
-      <w:lvlText w:val="%3."/>
-      <w:lvlJc w:val="right"/>
-      <w:pPr>
-        <w:ind w:left="2160" w:hanging="180"/>
-      </w:pPr>
-    </w:lvl>
-    <w:lvl w:ilvl="3" w:tplc="0409000F" w:tentative="1">
-      <w:start w:val="1"/>
-      <w:numFmt w:val="decimal"/>
-      <w:lvlText w:val="%4."/>
-      <w:lvlJc w:val="left"/>
-      <w:pPr>
-        <w:ind w:left="2880" w:hanging="360"/>
-      </w:pPr>
-    </w:lvl>
-    <w:lvl w:ilvl="4" w:tplc="04090019" w:tentative="1">
-      <w:start w:val="1"/>
-      <w:numFmt w:val="lowerLetter"/>
-      <w:lvlText w:val="%5."/>
-      <w:lvlJc w:val="left"/>
-      <w:pPr>
-        <w:ind w:left="3600" w:hanging="360"/>
-      </w:pPr>
-    </w:lvl>
-    <w:lvl w:ilvl="5" w:tplc="0409001B" w:tentative="1">
-      <w:start w:val="1"/>
-      <w:numFmt w:val="lowerRoman"/>
-      <w:lvlText w:val="%6."/>
-      <w:lvlJc w:val="right"/>
-      <w:pPr>
-        <w:ind w:left="4320" w:hanging="180"/>
-      </w:pPr>
-    </w:lvl>
-    <w:lvl w:ilvl="6" w:tplc="0409000F" w:tentative="1">
-      <w:start w:val="1"/>
-      <w:numFmt w:val="decimal"/>
-      <w:lvlText w:val="%7."/>
-      <w:lvlJc w:val="left"/>
-      <w:pPr>
-        <w:ind w:left="5040" w:hanging="360"/>
-      </w:pPr>
-    </w:lvl>
-    <w:lvl w:ilvl="7" w:tplc="04090019" w:tentative="1">
-      <w:start w:val="1"/>
-      <w:numFmt w:val="lowerLetter"/>
-      <w:lvlText w:val="%8."/>
-      <w:lvlJc w:val="left"/>
-      <w:pPr>
-        <w:ind w:left="5760" w:hanging="360"/>
-      </w:pPr>
-    </w:lvl>
-    <w:lvl w:ilvl="8" w:tplc="0409001B" w:tentative="1">
-      <w:start w:val="1"/>
-      <w:numFmt w:val="lowerRoman"/>
-      <w:lvlText w:val="%9."/>
-      <w:lvlJc w:val="right"/>
-      <w:pPr>
-        <w:ind w:left="6480" w:hanging="180"/>
-      </w:pPr>
-    </w:lvl>
-  </w:abstractNum>
-  <w:abstractNum w:abstractNumId="25" w15:restartNumberingAfterBreak="0">
+  <w:abstractNum w:abstractNumId="15" w15:restartNumberingAfterBreak="0">
     <w:nsid w:val="36C4314D"/>
     <w:multiLevelType w:val="hybridMultilevel"/>
     <w:tmpl w:val="1D7216D8"/>
@@ -21971,7 +20967,7 @@
       </w:pPr>
     </w:lvl>
   </w:abstractNum>
-  <w:abstractNum w:abstractNumId="26" w15:restartNumberingAfterBreak="0">
+  <w:abstractNum w:abstractNumId="16" w15:restartNumberingAfterBreak="0">
     <w:nsid w:val="3ACD1395"/>
     <w:multiLevelType w:val="hybridMultilevel"/>
     <w:tmpl w:val="C4B634E0"/>
@@ -22084,120 +21080,7 @@
       </w:rPr>
     </w:lvl>
   </w:abstractNum>
-  <w:abstractNum w:abstractNumId="27" w15:restartNumberingAfterBreak="0">
-    <w:nsid w:val="3D9A743E"/>
-    <w:multiLevelType w:val="hybridMultilevel"/>
-    <w:tmpl w:val="180CD6AA"/>
-    <w:lvl w:ilvl="0" w:tplc="04090001">
-      <w:start w:val="1"/>
-      <w:numFmt w:val="bullet"/>
-      <w:lvlText w:val=""/>
-      <w:lvlJc w:val="left"/>
-      <w:pPr>
-        <w:ind w:left="720" w:hanging="360"/>
-      </w:pPr>
-      <w:rPr>
-        <w:rFonts w:ascii="Symbol" w:hAnsi="Symbol" w:hint="default"/>
-      </w:rPr>
-    </w:lvl>
-    <w:lvl w:ilvl="1" w:tplc="04090003" w:tentative="1">
-      <w:start w:val="1"/>
-      <w:numFmt w:val="bullet"/>
-      <w:lvlText w:val="o"/>
-      <w:lvlJc w:val="left"/>
-      <w:pPr>
-        <w:ind w:left="1440" w:hanging="360"/>
-      </w:pPr>
-      <w:rPr>
-        <w:rFonts w:ascii="Courier New" w:hAnsi="Courier New" w:cs="Courier New" w:hint="default"/>
-      </w:rPr>
-    </w:lvl>
-    <w:lvl w:ilvl="2" w:tplc="04090005" w:tentative="1">
-      <w:start w:val="1"/>
-      <w:numFmt w:val="bullet"/>
-      <w:lvlText w:val=""/>
-      <w:lvlJc w:val="left"/>
-      <w:pPr>
-        <w:ind w:left="2160" w:hanging="360"/>
-      </w:pPr>
-      <w:rPr>
-        <w:rFonts w:ascii="Wingdings" w:hAnsi="Wingdings" w:hint="default"/>
-      </w:rPr>
-    </w:lvl>
-    <w:lvl w:ilvl="3" w:tplc="04090001" w:tentative="1">
-      <w:start w:val="1"/>
-      <w:numFmt w:val="bullet"/>
-      <w:lvlText w:val=""/>
-      <w:lvlJc w:val="left"/>
-      <w:pPr>
-        <w:ind w:left="2880" w:hanging="360"/>
-      </w:pPr>
-      <w:rPr>
-        <w:rFonts w:ascii="Symbol" w:hAnsi="Symbol" w:hint="default"/>
-      </w:rPr>
-    </w:lvl>
-    <w:lvl w:ilvl="4" w:tplc="04090003" w:tentative="1">
-      <w:start w:val="1"/>
-      <w:numFmt w:val="bullet"/>
-      <w:lvlText w:val="o"/>
-      <w:lvlJc w:val="left"/>
-      <w:pPr>
-        <w:ind w:left="3600" w:hanging="360"/>
-      </w:pPr>
-      <w:rPr>
-        <w:rFonts w:ascii="Courier New" w:hAnsi="Courier New" w:cs="Courier New" w:hint="default"/>
-      </w:rPr>
-    </w:lvl>
-    <w:lvl w:ilvl="5" w:tplc="04090005" w:tentative="1">
-      <w:start w:val="1"/>
-      <w:numFmt w:val="bullet"/>
-      <w:lvlText w:val=""/>
-      <w:lvlJc w:val="left"/>
-      <w:pPr>
-        <w:ind w:left="4320" w:hanging="360"/>
-      </w:pPr>
-      <w:rPr>
-        <w:rFonts w:ascii="Wingdings" w:hAnsi="Wingdings" w:hint="default"/>
-      </w:rPr>
-    </w:lvl>
-    <w:lvl w:ilvl="6" w:tplc="04090001" w:tentative="1">
-      <w:start w:val="1"/>
-      <w:numFmt w:val="bullet"/>
-      <w:lvlText w:val=""/>
-      <w:lvlJc w:val="left"/>
-      <w:pPr>
-        <w:ind w:left="5040" w:hanging="360"/>
-      </w:pPr>
-      <w:rPr>
-        <w:rFonts w:ascii="Symbol" w:hAnsi="Symbol" w:hint="default"/>
-      </w:rPr>
-    </w:lvl>
-    <w:lvl w:ilvl="7" w:tplc="04090003" w:tentative="1">
-      <w:start w:val="1"/>
-      <w:numFmt w:val="bullet"/>
-      <w:lvlText w:val="o"/>
-      <w:lvlJc w:val="left"/>
-      <w:pPr>
-        <w:ind w:left="5760" w:hanging="360"/>
-      </w:pPr>
-      <w:rPr>
-        <w:rFonts w:ascii="Courier New" w:hAnsi="Courier New" w:cs="Courier New" w:hint="default"/>
-      </w:rPr>
-    </w:lvl>
-    <w:lvl w:ilvl="8" w:tplc="04090005" w:tentative="1">
-      <w:start w:val="1"/>
-      <w:numFmt w:val="bullet"/>
-      <w:lvlText w:val=""/>
-      <w:lvlJc w:val="left"/>
-      <w:pPr>
-        <w:ind w:left="6480" w:hanging="360"/>
-      </w:pPr>
-      <w:rPr>
-        <w:rFonts w:ascii="Wingdings" w:hAnsi="Wingdings" w:hint="default"/>
-      </w:rPr>
-    </w:lvl>
-  </w:abstractNum>
-  <w:abstractNum w:abstractNumId="28" w15:restartNumberingAfterBreak="0">
+  <w:abstractNum w:abstractNumId="17" w15:restartNumberingAfterBreak="0">
     <w:nsid w:val="3DB4523A"/>
     <w:multiLevelType w:val="hybridMultilevel"/>
     <w:tmpl w:val="BD529E1A"/>
@@ -22288,7 +21171,7 @@
       </w:pPr>
     </w:lvl>
   </w:abstractNum>
-  <w:abstractNum w:abstractNumId="29" w15:restartNumberingAfterBreak="0">
+  <w:abstractNum w:abstractNumId="18" w15:restartNumberingAfterBreak="0">
     <w:nsid w:val="443E34F3"/>
     <w:multiLevelType w:val="hybridMultilevel"/>
     <w:tmpl w:val="0F0CAD64"/>
@@ -22400,7 +21283,7 @@
       </w:rPr>
     </w:lvl>
   </w:abstractNum>
-  <w:abstractNum w:abstractNumId="30" w15:restartNumberingAfterBreak="0">
+  <w:abstractNum w:abstractNumId="19" w15:restartNumberingAfterBreak="0">
     <w:nsid w:val="470F5FE4"/>
     <w:multiLevelType w:val="hybridMultilevel"/>
     <w:tmpl w:val="E1D2DF22"/>
@@ -22486,7 +21369,7 @@
       </w:pPr>
     </w:lvl>
   </w:abstractNum>
-  <w:abstractNum w:abstractNumId="31" w15:restartNumberingAfterBreak="0">
+  <w:abstractNum w:abstractNumId="20" w15:restartNumberingAfterBreak="0">
     <w:nsid w:val="47734C40"/>
     <w:multiLevelType w:val="hybridMultilevel"/>
     <w:tmpl w:val="EEE4598A"/>
@@ -22572,7 +21455,7 @@
       </w:pPr>
     </w:lvl>
   </w:abstractNum>
-  <w:abstractNum w:abstractNumId="32" w15:restartNumberingAfterBreak="0">
+  <w:abstractNum w:abstractNumId="21" w15:restartNumberingAfterBreak="0">
     <w:nsid w:val="48B32E3C"/>
     <w:multiLevelType w:val="hybridMultilevel"/>
     <w:tmpl w:val="F614F898"/>
@@ -22685,7 +21568,7 @@
       </w:rPr>
     </w:lvl>
   </w:abstractNum>
-  <w:abstractNum w:abstractNumId="33" w15:restartNumberingAfterBreak="0">
+  <w:abstractNum w:abstractNumId="22" w15:restartNumberingAfterBreak="0">
     <w:nsid w:val="4A416514"/>
     <w:multiLevelType w:val="hybridMultilevel"/>
     <w:tmpl w:val="E236F238"/>
@@ -22771,454 +21654,120 @@
       </w:pPr>
     </w:lvl>
   </w:abstractNum>
-  <w:abstractNum w:abstractNumId="34" w15:restartNumberingAfterBreak="0">
-    <w:nsid w:val="4B5D6DD9"/>
-    <w:multiLevelType w:val="multilevel"/>
-    <w:tmpl w:val="B520410E"/>
-    <w:lvl w:ilvl="0">
+  <w:abstractNum w:abstractNumId="23" w15:restartNumberingAfterBreak="0">
+    <w:nsid w:val="4C8C6984"/>
+    <w:multiLevelType w:val="hybridMultilevel"/>
+    <w:tmpl w:val="94FC06C4"/>
+    <w:lvl w:ilvl="0" w:tplc="6A8CDCA8">
+      <w:start w:val="1"/>
+      <w:numFmt w:val="decimal"/>
+      <w:lvlText w:val="%1."/>
+      <w:lvlJc w:val="left"/>
+      <w:pPr>
+        <w:ind w:left="720" w:hanging="360"/>
+      </w:pPr>
+      <w:rPr>
+        <w:rFonts w:hint="default"/>
+      </w:rPr>
+    </w:lvl>
+    <w:lvl w:ilvl="1" w:tplc="04090003" w:tentative="1">
+      <w:start w:val="1"/>
+      <w:numFmt w:val="bullet"/>
+      <w:lvlText w:val="o"/>
+      <w:lvlJc w:val="left"/>
+      <w:pPr>
+        <w:ind w:left="1440" w:hanging="360"/>
+      </w:pPr>
+      <w:rPr>
+        <w:rFonts w:ascii="Courier New" w:hAnsi="Courier New" w:cs="Courier New" w:hint="default"/>
+      </w:rPr>
+    </w:lvl>
+    <w:lvl w:ilvl="2" w:tplc="04090005" w:tentative="1">
+      <w:start w:val="1"/>
+      <w:numFmt w:val="bullet"/>
+      <w:lvlText w:val=""/>
+      <w:lvlJc w:val="left"/>
+      <w:pPr>
+        <w:ind w:left="2160" w:hanging="360"/>
+      </w:pPr>
+      <w:rPr>
+        <w:rFonts w:ascii="Wingdings" w:hAnsi="Wingdings" w:hint="default"/>
+      </w:rPr>
+    </w:lvl>
+    <w:lvl w:ilvl="3" w:tplc="04090001" w:tentative="1">
       <w:start w:val="1"/>
       <w:numFmt w:val="bullet"/>
       <w:lvlText w:val=""/>
       <w:lvlJc w:val="left"/>
       <w:pPr>
-        <w:tabs>
-          <w:tab w:val="num" w:pos="720"/>
-        </w:tabs>
-        <w:ind w:left="720" w:hanging="360"/>
+        <w:ind w:left="2880" w:hanging="360"/>
       </w:pPr>
       <w:rPr>
         <w:rFonts w:ascii="Symbol" w:hAnsi="Symbol" w:hint="default"/>
-        <w:sz w:val="20"/>
       </w:rPr>
     </w:lvl>
-    <w:lvl w:ilvl="1" w:tentative="1">
+    <w:lvl w:ilvl="4" w:tplc="04090003" w:tentative="1">
       <w:start w:val="1"/>
       <w:numFmt w:val="bullet"/>
       <w:lvlText w:val="o"/>
       <w:lvlJc w:val="left"/>
       <w:pPr>
-        <w:tabs>
-          <w:tab w:val="num" w:pos="1440"/>
-        </w:tabs>
-        <w:ind w:left="1440" w:hanging="360"/>
+        <w:ind w:left="3600" w:hanging="360"/>
       </w:pPr>
       <w:rPr>
-        <w:rFonts w:ascii="Courier New" w:hAnsi="Courier New" w:hint="default"/>
-        <w:sz w:val="20"/>
+        <w:rFonts w:ascii="Courier New" w:hAnsi="Courier New" w:cs="Courier New" w:hint="default"/>
       </w:rPr>
     </w:lvl>
-    <w:lvl w:ilvl="2" w:tentative="1">
+    <w:lvl w:ilvl="5" w:tplc="04090005" w:tentative="1">
       <w:start w:val="1"/>
       <w:numFmt w:val="bullet"/>
       <w:lvlText w:val=""/>
       <w:lvlJc w:val="left"/>
       <w:pPr>
-        <w:tabs>
-          <w:tab w:val="num" w:pos="2160"/>
-        </w:tabs>
-        <w:ind w:left="2160" w:hanging="360"/>
+        <w:ind w:left="4320" w:hanging="360"/>
       </w:pPr>
       <w:rPr>
         <w:rFonts w:ascii="Wingdings" w:hAnsi="Wingdings" w:hint="default"/>
-        <w:sz w:val="20"/>
       </w:rPr>
     </w:lvl>
-    <w:lvl w:ilvl="3" w:tentative="1">
+    <w:lvl w:ilvl="6" w:tplc="04090001" w:tentative="1">
+      <w:start w:val="1"/>
+      <w:numFmt w:val="bullet"/>
+      <w:lvlText w:val=""/>
+      <w:lvlJc w:val="left"/>
+      <w:pPr>
+        <w:ind w:left="5040" w:hanging="360"/>
+      </w:pPr>
+      <w:rPr>
+        <w:rFonts w:ascii="Symbol" w:hAnsi="Symbol" w:hint="default"/>
+      </w:rPr>
+    </w:lvl>
+    <w:lvl w:ilvl="7" w:tplc="04090003" w:tentative="1">
+      <w:start w:val="1"/>
+      <w:numFmt w:val="bullet"/>
+      <w:lvlText w:val="o"/>
+      <w:lvlJc w:val="left"/>
+      <w:pPr>
+        <w:ind w:left="5760" w:hanging="360"/>
+      </w:pPr>
+      <w:rPr>
+        <w:rFonts w:ascii="Courier New" w:hAnsi="Courier New" w:cs="Courier New" w:hint="default"/>
+      </w:rPr>
+    </w:lvl>
+    <w:lvl w:ilvl="8" w:tplc="04090005" w:tentative="1">
       <w:start w:val="1"/>
       <w:numFmt w:val="bullet"/>
       <w:lvlText w:val=""/>
       <w:lvlJc w:val="left"/>
       <w:pPr>
-        <w:tabs>
-          <w:tab w:val="num" w:pos="2880"/>
-        </w:tabs>
-        <w:ind w:left="2880" w:hanging="360"/>
+        <w:ind w:left="6480" w:hanging="360"/>
       </w:pPr>
       <w:rPr>
         <w:rFonts w:ascii="Wingdings" w:hAnsi="Wingdings" w:hint="default"/>
-        <w:sz w:val="20"/>
       </w:rPr>
     </w:lvl>
-    <w:lvl w:ilvl="4" w:tentative="1">
-      <w:start w:val="1"/>
-      <w:numFmt w:val="bullet"/>
-      <w:lvlText w:val=""/>
-      <w:lvlJc w:val="left"/>
-      <w:pPr>
-        <w:tabs>
-          <w:tab w:val="num" w:pos="3600"/>
-        </w:tabs>
-        <w:ind w:left="3600" w:hanging="360"/>
-      </w:pPr>
-      <w:rPr>
-        <w:rFonts w:ascii="Wingdings" w:hAnsi="Wingdings" w:hint="default"/>
-        <w:sz w:val="20"/>
-      </w:rPr>
-    </w:lvl>
-    <w:lvl w:ilvl="5" w:tentative="1">
-      <w:start w:val="1"/>
-      <w:numFmt w:val="bullet"/>
-      <w:lvlText w:val=""/>
-      <w:lvlJc w:val="left"/>
-      <w:pPr>
-        <w:tabs>
-          <w:tab w:val="num" w:pos="4320"/>
-        </w:tabs>
-        <w:ind w:left="4320" w:hanging="360"/>
-      </w:pPr>
-      <w:rPr>
-        <w:rFonts w:ascii="Wingdings" w:hAnsi="Wingdings" w:hint="default"/>
-        <w:sz w:val="20"/>
-      </w:rPr>
-    </w:lvl>
-    <w:lvl w:ilvl="6" w:tentative="1">
-      <w:start w:val="1"/>
-      <w:numFmt w:val="bullet"/>
-      <w:lvlText w:val=""/>
-      <w:lvlJc w:val="left"/>
-      <w:pPr>
-        <w:tabs>
-          <w:tab w:val="num" w:pos="5040"/>
-        </w:tabs>
-        <w:ind w:left="5040" w:hanging="360"/>
-      </w:pPr>
-      <w:rPr>
-        <w:rFonts w:ascii="Wingdings" w:hAnsi="Wingdings" w:hint="default"/>
-        <w:sz w:val="20"/>
-      </w:rPr>
-    </w:lvl>
-    <w:lvl w:ilvl="7" w:tentative="1">
-      <w:start w:val="1"/>
-      <w:numFmt w:val="bullet"/>
-      <w:lvlText w:val=""/>
-      <w:lvlJc w:val="left"/>
-      <w:pPr>
-        <w:tabs>
-          <w:tab w:val="num" w:pos="5760"/>
-        </w:tabs>
-        <w:ind w:left="5760" w:hanging="360"/>
-      </w:pPr>
-      <w:rPr>
-        <w:rFonts w:ascii="Wingdings" w:hAnsi="Wingdings" w:hint="default"/>
-        <w:sz w:val="20"/>
-      </w:rPr>
-    </w:lvl>
-    <w:lvl w:ilvl="8" w:tentative="1">
-      <w:start w:val="1"/>
-      <w:numFmt w:val="bullet"/>
-      <w:lvlText w:val=""/>
-      <w:lvlJc w:val="left"/>
-      <w:pPr>
-        <w:tabs>
-          <w:tab w:val="num" w:pos="6480"/>
-        </w:tabs>
-        <w:ind w:left="6480" w:hanging="360"/>
-      </w:pPr>
-      <w:rPr>
-        <w:rFonts w:ascii="Wingdings" w:hAnsi="Wingdings" w:hint="default"/>
-        <w:sz w:val="20"/>
-      </w:rPr>
-    </w:lvl>
   </w:abstractNum>
-  <w:abstractNum w:abstractNumId="35" w15:restartNumberingAfterBreak="0">
-    <w:nsid w:val="4E7401F1"/>
-    <w:multiLevelType w:val="multilevel"/>
-    <w:tmpl w:val="38F09F84"/>
-    <w:lvl w:ilvl="0">
-      <w:start w:val="1"/>
-      <w:numFmt w:val="bullet"/>
-      <w:lvlText w:val=""/>
-      <w:lvlJc w:val="left"/>
-      <w:pPr>
-        <w:tabs>
-          <w:tab w:val="num" w:pos="720"/>
-        </w:tabs>
-        <w:ind w:left="720" w:hanging="360"/>
-      </w:pPr>
-      <w:rPr>
-        <w:rFonts w:ascii="Symbol" w:hAnsi="Symbol" w:hint="default"/>
-        <w:sz w:val="20"/>
-      </w:rPr>
-    </w:lvl>
-    <w:lvl w:ilvl="1" w:tentative="1">
-      <w:start w:val="1"/>
-      <w:numFmt w:val="bullet"/>
-      <w:lvlText w:val="o"/>
-      <w:lvlJc w:val="left"/>
-      <w:pPr>
-        <w:tabs>
-          <w:tab w:val="num" w:pos="1440"/>
-        </w:tabs>
-        <w:ind w:left="1440" w:hanging="360"/>
-      </w:pPr>
-      <w:rPr>
-        <w:rFonts w:ascii="Courier New" w:hAnsi="Courier New" w:hint="default"/>
-        <w:sz w:val="20"/>
-      </w:rPr>
-    </w:lvl>
-    <w:lvl w:ilvl="2" w:tentative="1">
-      <w:start w:val="1"/>
-      <w:numFmt w:val="bullet"/>
-      <w:lvlText w:val=""/>
-      <w:lvlJc w:val="left"/>
-      <w:pPr>
-        <w:tabs>
-          <w:tab w:val="num" w:pos="2160"/>
-        </w:tabs>
-        <w:ind w:left="2160" w:hanging="360"/>
-      </w:pPr>
-      <w:rPr>
-        <w:rFonts w:ascii="Wingdings" w:hAnsi="Wingdings" w:hint="default"/>
-        <w:sz w:val="20"/>
-      </w:rPr>
-    </w:lvl>
-    <w:lvl w:ilvl="3" w:tentative="1">
-      <w:start w:val="1"/>
-      <w:numFmt w:val="bullet"/>
-      <w:lvlText w:val=""/>
-      <w:lvlJc w:val="left"/>
-      <w:pPr>
-        <w:tabs>
-          <w:tab w:val="num" w:pos="2880"/>
-        </w:tabs>
-        <w:ind w:left="2880" w:hanging="360"/>
-      </w:pPr>
-      <w:rPr>
-        <w:rFonts w:ascii="Wingdings" w:hAnsi="Wingdings" w:hint="default"/>
-        <w:sz w:val="20"/>
-      </w:rPr>
-    </w:lvl>
-    <w:lvl w:ilvl="4" w:tentative="1">
-      <w:start w:val="1"/>
-      <w:numFmt w:val="bullet"/>
-      <w:lvlText w:val=""/>
-      <w:lvlJc w:val="left"/>
-      <w:pPr>
-        <w:tabs>
-          <w:tab w:val="num" w:pos="3600"/>
-        </w:tabs>
-        <w:ind w:left="3600" w:hanging="360"/>
-      </w:pPr>
-      <w:rPr>
-        <w:rFonts w:ascii="Wingdings" w:hAnsi="Wingdings" w:hint="default"/>
-        <w:sz w:val="20"/>
-      </w:rPr>
-    </w:lvl>
-    <w:lvl w:ilvl="5" w:tentative="1">
-      <w:start w:val="1"/>
-      <w:numFmt w:val="bullet"/>
-      <w:lvlText w:val=""/>
-      <w:lvlJc w:val="left"/>
-      <w:pPr>
-        <w:tabs>
-          <w:tab w:val="num" w:pos="4320"/>
-        </w:tabs>
-        <w:ind w:left="4320" w:hanging="360"/>
-      </w:pPr>
-      <w:rPr>
-        <w:rFonts w:ascii="Wingdings" w:hAnsi="Wingdings" w:hint="default"/>
-        <w:sz w:val="20"/>
-      </w:rPr>
-    </w:lvl>
-    <w:lvl w:ilvl="6" w:tentative="1">
-      <w:start w:val="1"/>
-      <w:numFmt w:val="bullet"/>
-      <w:lvlText w:val=""/>
-      <w:lvlJc w:val="left"/>
-      <w:pPr>
-        <w:tabs>
-          <w:tab w:val="num" w:pos="5040"/>
-        </w:tabs>
-        <w:ind w:left="5040" w:hanging="360"/>
-      </w:pPr>
-      <w:rPr>
-        <w:rFonts w:ascii="Wingdings" w:hAnsi="Wingdings" w:hint="default"/>
-        <w:sz w:val="20"/>
-      </w:rPr>
-    </w:lvl>
-    <w:lvl w:ilvl="7" w:tentative="1">
-      <w:start w:val="1"/>
-      <w:numFmt w:val="bullet"/>
-      <w:lvlText w:val=""/>
-      <w:lvlJc w:val="left"/>
-      <w:pPr>
-        <w:tabs>
-          <w:tab w:val="num" w:pos="5760"/>
-        </w:tabs>
-        <w:ind w:left="5760" w:hanging="360"/>
-      </w:pPr>
-      <w:rPr>
-        <w:rFonts w:ascii="Wingdings" w:hAnsi="Wingdings" w:hint="default"/>
-        <w:sz w:val="20"/>
-      </w:rPr>
-    </w:lvl>
-    <w:lvl w:ilvl="8" w:tentative="1">
-      <w:start w:val="1"/>
-      <w:numFmt w:val="bullet"/>
-      <w:lvlText w:val=""/>
-      <w:lvlJc w:val="left"/>
-      <w:pPr>
-        <w:tabs>
-          <w:tab w:val="num" w:pos="6480"/>
-        </w:tabs>
-        <w:ind w:left="6480" w:hanging="360"/>
-      </w:pPr>
-      <w:rPr>
-        <w:rFonts w:ascii="Wingdings" w:hAnsi="Wingdings" w:hint="default"/>
-        <w:sz w:val="20"/>
-      </w:rPr>
-    </w:lvl>
-  </w:abstractNum>
-  <w:abstractNum w:abstractNumId="36" w15:restartNumberingAfterBreak="0">
-    <w:nsid w:val="588826D5"/>
-    <w:multiLevelType w:val="multilevel"/>
-    <w:tmpl w:val="38F09F84"/>
-    <w:lvl w:ilvl="0">
-      <w:start w:val="1"/>
-      <w:numFmt w:val="bullet"/>
-      <w:lvlText w:val=""/>
-      <w:lvlJc w:val="left"/>
-      <w:pPr>
-        <w:tabs>
-          <w:tab w:val="num" w:pos="720"/>
-        </w:tabs>
-        <w:ind w:left="720" w:hanging="360"/>
-      </w:pPr>
-      <w:rPr>
-        <w:rFonts w:ascii="Symbol" w:hAnsi="Symbol" w:hint="default"/>
-        <w:sz w:val="20"/>
-      </w:rPr>
-    </w:lvl>
-    <w:lvl w:ilvl="1" w:tentative="1">
-      <w:start w:val="1"/>
-      <w:numFmt w:val="bullet"/>
-      <w:lvlText w:val="o"/>
-      <w:lvlJc w:val="left"/>
-      <w:pPr>
-        <w:tabs>
-          <w:tab w:val="num" w:pos="1440"/>
-        </w:tabs>
-        <w:ind w:left="1440" w:hanging="360"/>
-      </w:pPr>
-      <w:rPr>
-        <w:rFonts w:ascii="Courier New" w:hAnsi="Courier New" w:hint="default"/>
-        <w:sz w:val="20"/>
-      </w:rPr>
-    </w:lvl>
-    <w:lvl w:ilvl="2" w:tentative="1">
-      <w:start w:val="1"/>
-      <w:numFmt w:val="bullet"/>
-      <w:lvlText w:val=""/>
-      <w:lvlJc w:val="left"/>
-      <w:pPr>
-        <w:tabs>
-          <w:tab w:val="num" w:pos="2160"/>
-        </w:tabs>
-        <w:ind w:left="2160" w:hanging="360"/>
-      </w:pPr>
-      <w:rPr>
-        <w:rFonts w:ascii="Wingdings" w:hAnsi="Wingdings" w:hint="default"/>
-        <w:sz w:val="20"/>
-      </w:rPr>
-    </w:lvl>
-    <w:lvl w:ilvl="3" w:tentative="1">
-      <w:start w:val="1"/>
-      <w:numFmt w:val="bullet"/>
-      <w:lvlText w:val=""/>
-      <w:lvlJc w:val="left"/>
-      <w:pPr>
-        <w:tabs>
-          <w:tab w:val="num" w:pos="2880"/>
-        </w:tabs>
-        <w:ind w:left="2880" w:hanging="360"/>
-      </w:pPr>
-      <w:rPr>
-        <w:rFonts w:ascii="Wingdings" w:hAnsi="Wingdings" w:hint="default"/>
-        <w:sz w:val="20"/>
-      </w:rPr>
-    </w:lvl>
-    <w:lvl w:ilvl="4" w:tentative="1">
-      <w:start w:val="1"/>
-      <w:numFmt w:val="bullet"/>
-      <w:lvlText w:val=""/>
-      <w:lvlJc w:val="left"/>
-      <w:pPr>
-        <w:tabs>
-          <w:tab w:val="num" w:pos="3600"/>
-        </w:tabs>
-        <w:ind w:left="3600" w:hanging="360"/>
-      </w:pPr>
-      <w:rPr>
-        <w:rFonts w:ascii="Wingdings" w:hAnsi="Wingdings" w:hint="default"/>
-        <w:sz w:val="20"/>
-      </w:rPr>
-    </w:lvl>
-    <w:lvl w:ilvl="5" w:tentative="1">
-      <w:start w:val="1"/>
-      <w:numFmt w:val="bullet"/>
-      <w:lvlText w:val=""/>
-      <w:lvlJc w:val="left"/>
-      <w:pPr>
-        <w:tabs>
-          <w:tab w:val="num" w:pos="4320"/>
-        </w:tabs>
-        <w:ind w:left="4320" w:hanging="360"/>
-      </w:pPr>
-      <w:rPr>
-        <w:rFonts w:ascii="Wingdings" w:hAnsi="Wingdings" w:hint="default"/>
-        <w:sz w:val="20"/>
-      </w:rPr>
-    </w:lvl>
-    <w:lvl w:ilvl="6" w:tentative="1">
-      <w:start w:val="1"/>
-      <w:numFmt w:val="bullet"/>
-      <w:lvlText w:val=""/>
-      <w:lvlJc w:val="left"/>
-      <w:pPr>
-        <w:tabs>
-          <w:tab w:val="num" w:pos="5040"/>
-        </w:tabs>
-        <w:ind w:left="5040" w:hanging="360"/>
-      </w:pPr>
-      <w:rPr>
-        <w:rFonts w:ascii="Wingdings" w:hAnsi="Wingdings" w:hint="default"/>
-        <w:sz w:val="20"/>
-      </w:rPr>
-    </w:lvl>
-    <w:lvl w:ilvl="7" w:tentative="1">
-      <w:start w:val="1"/>
-      <w:numFmt w:val="bullet"/>
-      <w:lvlText w:val=""/>
-      <w:lvlJc w:val="left"/>
-      <w:pPr>
-        <w:tabs>
-          <w:tab w:val="num" w:pos="5760"/>
-        </w:tabs>
-        <w:ind w:left="5760" w:hanging="360"/>
-      </w:pPr>
-      <w:rPr>
-        <w:rFonts w:ascii="Wingdings" w:hAnsi="Wingdings" w:hint="default"/>
-        <w:sz w:val="20"/>
-      </w:rPr>
-    </w:lvl>
-    <w:lvl w:ilvl="8" w:tentative="1">
-      <w:start w:val="1"/>
-      <w:numFmt w:val="bullet"/>
-      <w:lvlText w:val=""/>
-      <w:lvlJc w:val="left"/>
-      <w:pPr>
-        <w:tabs>
-          <w:tab w:val="num" w:pos="6480"/>
-        </w:tabs>
-        <w:ind w:left="6480" w:hanging="360"/>
-      </w:pPr>
-      <w:rPr>
-        <w:rFonts w:ascii="Wingdings" w:hAnsi="Wingdings" w:hint="default"/>
-        <w:sz w:val="20"/>
-      </w:rPr>
-    </w:lvl>
-  </w:abstractNum>
-  <w:abstractNum w:abstractNumId="37" w15:restartNumberingAfterBreak="0">
+  <w:abstractNum w:abstractNumId="24" w15:restartNumberingAfterBreak="0">
     <w:nsid w:val="58964679"/>
     <w:multiLevelType w:val="hybridMultilevel"/>
     <w:tmpl w:val="9136344A"/>
@@ -23330,7 +21879,7 @@
       </w:rPr>
     </w:lvl>
   </w:abstractNum>
-  <w:abstractNum w:abstractNumId="38" w15:restartNumberingAfterBreak="0">
+  <w:abstractNum w:abstractNumId="25" w15:restartNumberingAfterBreak="0">
     <w:nsid w:val="58E765E0"/>
     <w:multiLevelType w:val="hybridMultilevel"/>
     <w:tmpl w:val="3C1A0076"/>
@@ -23425,156 +21974,7 @@
       </w:pPr>
     </w:lvl>
   </w:abstractNum>
-  <w:abstractNum w:abstractNumId="39" w15:restartNumberingAfterBreak="0">
-    <w:nsid w:val="597A6DF2"/>
-    <w:multiLevelType w:val="multilevel"/>
-    <w:tmpl w:val="6A7216DC"/>
-    <w:lvl w:ilvl="0">
-      <w:start w:val="1"/>
-      <w:numFmt w:val="bullet"/>
-      <w:lvlText w:val=""/>
-      <w:lvlJc w:val="left"/>
-      <w:pPr>
-        <w:tabs>
-          <w:tab w:val="num" w:pos="720"/>
-        </w:tabs>
-        <w:ind w:left="720" w:hanging="360"/>
-      </w:pPr>
-      <w:rPr>
-        <w:rFonts w:ascii="Symbol" w:hAnsi="Symbol" w:hint="default"/>
-        <w:sz w:val="20"/>
-      </w:rPr>
-    </w:lvl>
-    <w:lvl w:ilvl="1" w:tentative="1">
-      <w:start w:val="1"/>
-      <w:numFmt w:val="bullet"/>
-      <w:lvlText w:val="o"/>
-      <w:lvlJc w:val="left"/>
-      <w:pPr>
-        <w:tabs>
-          <w:tab w:val="num" w:pos="1440"/>
-        </w:tabs>
-        <w:ind w:left="1440" w:hanging="360"/>
-      </w:pPr>
-      <w:rPr>
-        <w:rFonts w:ascii="Courier New" w:hAnsi="Courier New" w:hint="default"/>
-        <w:sz w:val="20"/>
-      </w:rPr>
-    </w:lvl>
-    <w:lvl w:ilvl="2" w:tentative="1">
-      <w:start w:val="1"/>
-      <w:numFmt w:val="bullet"/>
-      <w:lvlText w:val=""/>
-      <w:lvlJc w:val="left"/>
-      <w:pPr>
-        <w:tabs>
-          <w:tab w:val="num" w:pos="2160"/>
-        </w:tabs>
-        <w:ind w:left="2160" w:hanging="360"/>
-      </w:pPr>
-      <w:rPr>
-        <w:rFonts w:ascii="Wingdings" w:hAnsi="Wingdings" w:hint="default"/>
-        <w:sz w:val="20"/>
-      </w:rPr>
-    </w:lvl>
-    <w:lvl w:ilvl="3" w:tentative="1">
-      <w:start w:val="1"/>
-      <w:numFmt w:val="bullet"/>
-      <w:lvlText w:val=""/>
-      <w:lvlJc w:val="left"/>
-      <w:pPr>
-        <w:tabs>
-          <w:tab w:val="num" w:pos="2880"/>
-        </w:tabs>
-        <w:ind w:left="2880" w:hanging="360"/>
-      </w:pPr>
-      <w:rPr>
-        <w:rFonts w:ascii="Wingdings" w:hAnsi="Wingdings" w:hint="default"/>
-        <w:sz w:val="20"/>
-      </w:rPr>
-    </w:lvl>
-    <w:lvl w:ilvl="4" w:tentative="1">
-      <w:start w:val="1"/>
-      <w:numFmt w:val="bullet"/>
-      <w:lvlText w:val=""/>
-      <w:lvlJc w:val="left"/>
-      <w:pPr>
-        <w:tabs>
-          <w:tab w:val="num" w:pos="3600"/>
-        </w:tabs>
-        <w:ind w:left="3600" w:hanging="360"/>
-      </w:pPr>
-      <w:rPr>
-        <w:rFonts w:ascii="Wingdings" w:hAnsi="Wingdings" w:hint="default"/>
-        <w:sz w:val="20"/>
-      </w:rPr>
-    </w:lvl>
-    <w:lvl w:ilvl="5" w:tentative="1">
-      <w:start w:val="1"/>
-      <w:numFmt w:val="bullet"/>
-      <w:lvlText w:val=""/>
-      <w:lvlJc w:val="left"/>
-      <w:pPr>
-        <w:tabs>
-          <w:tab w:val="num" w:pos="4320"/>
-        </w:tabs>
-        <w:ind w:left="4320" w:hanging="360"/>
-      </w:pPr>
-      <w:rPr>
-        <w:rFonts w:ascii="Wingdings" w:hAnsi="Wingdings" w:hint="default"/>
-        <w:sz w:val="20"/>
-      </w:rPr>
-    </w:lvl>
-    <w:lvl w:ilvl="6" w:tentative="1">
-      <w:start w:val="1"/>
-      <w:numFmt w:val="bullet"/>
-      <w:lvlText w:val=""/>
-      <w:lvlJc w:val="left"/>
-      <w:pPr>
-        <w:tabs>
-          <w:tab w:val="num" w:pos="5040"/>
-        </w:tabs>
-        <w:ind w:left="5040" w:hanging="360"/>
-      </w:pPr>
-      <w:rPr>
-        <w:rFonts w:ascii="Wingdings" w:hAnsi="Wingdings" w:hint="default"/>
-        <w:sz w:val="20"/>
-      </w:rPr>
-    </w:lvl>
-    <w:lvl w:ilvl="7" w:tentative="1">
-      <w:start w:val="1"/>
-      <w:numFmt w:val="bullet"/>
-      <w:lvlText w:val=""/>
-      <w:lvlJc w:val="left"/>
-      <w:pPr>
-        <w:tabs>
-          <w:tab w:val="num" w:pos="5760"/>
-        </w:tabs>
-        <w:ind w:left="5760" w:hanging="360"/>
-      </w:pPr>
-      <w:rPr>
-        <w:rFonts w:ascii="Wingdings" w:hAnsi="Wingdings" w:hint="default"/>
-        <w:sz w:val="20"/>
-      </w:rPr>
-    </w:lvl>
-    <w:lvl w:ilvl="8" w:tentative="1">
-      <w:start w:val="1"/>
-      <w:numFmt w:val="bullet"/>
-      <w:lvlText w:val=""/>
-      <w:lvlJc w:val="left"/>
-      <w:pPr>
-        <w:tabs>
-          <w:tab w:val="num" w:pos="6480"/>
-        </w:tabs>
-        <w:ind w:left="6480" w:hanging="360"/>
-      </w:pPr>
-      <w:rPr>
-        <w:rFonts w:ascii="Wingdings" w:hAnsi="Wingdings" w:hint="default"/>
-        <w:sz w:val="20"/>
-      </w:rPr>
-    </w:lvl>
-  </w:abstractNum>
-  <w:abstractNum w:abstractNumId="40" w15:restartNumberingAfterBreak="0">
+  <w:abstractNum w:abstractNumId="26" w15:restartNumberingAfterBreak="0">
     <w:nsid w:val="5AA25528"/>
     <w:multiLevelType w:val="hybridMultilevel"/>
     <w:tmpl w:val="5D724F38"/>
@@ -23687,93 +22087,7 @@
       </w:rPr>
     </w:lvl>
   </w:abstractNum>
-  <w:abstractNum w:abstractNumId="41" w15:restartNumberingAfterBreak="0">
-    <w:nsid w:val="5F0D49D4"/>
-    <w:multiLevelType w:val="hybridMultilevel"/>
-    <w:tmpl w:val="1B8E913C"/>
-    <w:lvl w:ilvl="0" w:tplc="0409000F">
-      <w:start w:val="1"/>
-      <w:numFmt w:val="decimal"/>
-      <w:lvlText w:val="%1."/>
-      <w:lvlJc w:val="left"/>
-      <w:pPr>
-        <w:ind w:left="720" w:hanging="360"/>
-      </w:pPr>
-    </w:lvl>
-    <w:lvl w:ilvl="1" w:tplc="04090019" w:tentative="1">
-      <w:start w:val="1"/>
-      <w:numFmt w:val="lowerLetter"/>
-      <w:lvlText w:val="%2."/>
-      <w:lvlJc w:val="left"/>
-      <w:pPr>
-        <w:ind w:left="1440" w:hanging="360"/>
-      </w:pPr>
-    </w:lvl>
-    <w:lvl w:ilvl="2" w:tplc="0409001B" w:tentative="1">
-      <w:start w:val="1"/>
-      <w:numFmt w:val="lowerRoman"/>
-      <w:lvlText w:val="%3."/>
-      <w:lvlJc w:val="right"/>
-      <w:pPr>
-        <w:ind w:left="2160" w:hanging="180"/>
-      </w:pPr>
-    </w:lvl>
-    <w:lvl w:ilvl="3" w:tplc="0409000F" w:tentative="1">
-      <w:start w:val="1"/>
-      <w:numFmt w:val="decimal"/>
-      <w:lvlText w:val="%4."/>
-      <w:lvlJc w:val="left"/>
-      <w:pPr>
-        <w:ind w:left="2880" w:hanging="360"/>
-      </w:pPr>
-    </w:lvl>
-    <w:lvl w:ilvl="4" w:tplc="04090019" w:tentative="1">
-      <w:start w:val="1"/>
-      <w:numFmt w:val="lowerLetter"/>
-      <w:lvlText w:val="%5."/>
-      <w:lvlJc w:val="left"/>
-      <w:pPr>
-        <w:ind w:left="3600" w:hanging="360"/>
-      </w:pPr>
-    </w:lvl>
-    <w:lvl w:ilvl="5" w:tplc="0409001B" w:tentative="1">
-      <w:start w:val="1"/>
-      <w:numFmt w:val="lowerRoman"/>
-      <w:lvlText w:val="%6."/>
-      <w:lvlJc w:val="right"/>
-      <w:pPr>
-        <w:ind w:left="4320" w:hanging="180"/>
-      </w:pPr>
-    </w:lvl>
-    <w:lvl w:ilvl="6" w:tplc="0409000F" w:tentative="1">
-      <w:start w:val="1"/>
-      <w:numFmt w:val="decimal"/>
-      <w:lvlText w:val="%7."/>
-      <w:lvlJc w:val="left"/>
-      <w:pPr>
-        <w:ind w:left="5040" w:hanging="360"/>
-      </w:pPr>
-    </w:lvl>
-    <w:lvl w:ilvl="7" w:tplc="04090019" w:tentative="1">
-      <w:start w:val="1"/>
-      <w:numFmt w:val="lowerLetter"/>
-      <w:lvlText w:val="%8."/>
-      <w:lvlJc w:val="left"/>
-      <w:pPr>
-        <w:ind w:left="5760" w:hanging="360"/>
-      </w:pPr>
-    </w:lvl>
-    <w:lvl w:ilvl="8" w:tplc="0409001B" w:tentative="1">
-      <w:start w:val="1"/>
-      <w:numFmt w:val="lowerRoman"/>
-      <w:lvlText w:val="%9."/>
-      <w:lvlJc w:val="right"/>
-      <w:pPr>
-        <w:ind w:left="6480" w:hanging="180"/>
-      </w:pPr>
-    </w:lvl>
-  </w:abstractNum>
-  <w:abstractNum w:abstractNumId="42" w15:restartNumberingAfterBreak="0">
+  <w:abstractNum w:abstractNumId="27" w15:restartNumberingAfterBreak="0">
     <w:nsid w:val="63E1095A"/>
     <w:multiLevelType w:val="hybridMultilevel"/>
     <w:tmpl w:val="F86CFDEE"/>
@@ -23859,7 +22173,7 @@
       </w:pPr>
     </w:lvl>
   </w:abstractNum>
-  <w:abstractNum w:abstractNumId="43" w15:restartNumberingAfterBreak="0">
+  <w:abstractNum w:abstractNumId="28" w15:restartNumberingAfterBreak="0">
     <w:nsid w:val="6D7319C4"/>
     <w:multiLevelType w:val="hybridMultilevel"/>
     <w:tmpl w:val="4D22666E"/>
@@ -23971,7 +22285,7 @@
       </w:rPr>
     </w:lvl>
   </w:abstractNum>
-  <w:abstractNum w:abstractNumId="44" w15:restartNumberingAfterBreak="0">
+  <w:abstractNum w:abstractNumId="29" w15:restartNumberingAfterBreak="0">
     <w:nsid w:val="6E865BE3"/>
     <w:multiLevelType w:val="hybridMultilevel"/>
     <w:tmpl w:val="D5A0F6FC"/>
@@ -24084,7 +22398,7 @@
       </w:rPr>
     </w:lvl>
   </w:abstractNum>
-  <w:abstractNum w:abstractNumId="45" w15:restartNumberingAfterBreak="0">
+  <w:abstractNum w:abstractNumId="30" w15:restartNumberingAfterBreak="0">
     <w:nsid w:val="6E9D58C3"/>
     <w:multiLevelType w:val="hybridMultilevel"/>
     <w:tmpl w:val="FDA0AA64"/>
@@ -24196,14 +22510,14 @@
       </w:rPr>
     </w:lvl>
   </w:abstractNum>
-  <w:abstractNum w:abstractNumId="46" w15:restartNumberingAfterBreak="0">
-    <w:nsid w:val="70E54863"/>
+  <w:abstractNum w:abstractNumId="31" w15:restartNumberingAfterBreak="0">
+    <w:nsid w:val="77B521CA"/>
     <w:multiLevelType w:val="multilevel"/>
-    <w:tmpl w:val="38F09F84"/>
+    <w:tmpl w:val="E8D25FA6"/>
     <w:lvl w:ilvl="0">
       <w:start w:val="1"/>
-      <w:numFmt w:val="bullet"/>
-      <w:lvlText w:val=""/>
+      <w:numFmt w:val="decimal"/>
+      <w:lvlText w:val="%1."/>
       <w:lvlJc w:val="left"/>
       <w:pPr>
         <w:tabs>
@@ -24211,15 +22525,11 @@
         </w:tabs>
         <w:ind w:left="720" w:hanging="360"/>
       </w:pPr>
-      <w:rPr>
-        <w:rFonts w:ascii="Symbol" w:hAnsi="Symbol" w:hint="default"/>
-        <w:sz w:val="20"/>
-      </w:rPr>
     </w:lvl>
     <w:lvl w:ilvl="1" w:tentative="1">
       <w:start w:val="1"/>
-      <w:numFmt w:val="bullet"/>
-      <w:lvlText w:val="o"/>
+      <w:numFmt w:val="decimal"/>
+      <w:lvlText w:val="%2."/>
       <w:lvlJc w:val="left"/>
       <w:pPr>
         <w:tabs>
@@ -24227,15 +22537,11 @@
         </w:tabs>
         <w:ind w:left="1440" w:hanging="360"/>
       </w:pPr>
-      <w:rPr>
-        <w:rFonts w:ascii="Courier New" w:hAnsi="Courier New" w:hint="default"/>
-        <w:sz w:val="20"/>
-      </w:rPr>
     </w:lvl>
     <w:lvl w:ilvl="2" w:tentative="1">
       <w:start w:val="1"/>
-      <w:numFmt w:val="bullet"/>
-      <w:lvlText w:val=""/>
+      <w:numFmt w:val="decimal"/>
+      <w:lvlText w:val="%3."/>
       <w:lvlJc w:val="left"/>
       <w:pPr>
         <w:tabs>
@@ -24243,15 +22549,11 @@
         </w:tabs>
         <w:ind w:left="2160" w:hanging="360"/>
       </w:pPr>
-      <w:rPr>
-        <w:rFonts w:ascii="Wingdings" w:hAnsi="Wingdings" w:hint="default"/>
-        <w:sz w:val="20"/>
-      </w:rPr>
     </w:lvl>
     <w:lvl w:ilvl="3" w:tentative="1">
       <w:start w:val="1"/>
-      <w:numFmt w:val="bullet"/>
-      <w:lvlText w:val=""/>
+      <w:numFmt w:val="decimal"/>
+      <w:lvlText w:val="%4."/>
       <w:lvlJc w:val="left"/>
       <w:pPr>
         <w:tabs>
@@ -24259,15 +22561,11 @@
         </w:tabs>
         <w:ind w:left="2880" w:hanging="360"/>
       </w:pPr>
-      <w:rPr>
-        <w:rFonts w:ascii="Wingdings" w:hAnsi="Wingdings" w:hint="default"/>
-        <w:sz w:val="20"/>
-      </w:rPr>
     </w:lvl>
     <w:lvl w:ilvl="4" w:tentative="1">
       <w:start w:val="1"/>
-      <w:numFmt w:val="bullet"/>
-      <w:lvlText w:val=""/>
+      <w:numFmt w:val="decimal"/>
+      <w:lvlText w:val="%5."/>
       <w:lvlJc w:val="left"/>
       <w:pPr>
         <w:tabs>
@@ -24275,15 +22573,11 @@
         </w:tabs>
         <w:ind w:left="3600" w:hanging="360"/>
       </w:pPr>
-      <w:rPr>
-        <w:rFonts w:ascii="Wingdings" w:hAnsi="Wingdings" w:hint="default"/>
-        <w:sz w:val="20"/>
-      </w:rPr>
     </w:lvl>
     <w:lvl w:ilvl="5" w:tentative="1">
       <w:start w:val="1"/>
-      <w:numFmt w:val="bullet"/>
-      <w:lvlText w:val=""/>
+      <w:numFmt w:val="decimal"/>
+      <w:lvlText w:val="%6."/>
       <w:lvlJc w:val="left"/>
       <w:pPr>
         <w:tabs>
@@ -24291,15 +22585,11 @@
         </w:tabs>
         <w:ind w:left="4320" w:hanging="360"/>
       </w:pPr>
-      <w:rPr>
-        <w:rFonts w:ascii="Wingdings" w:hAnsi="Wingdings" w:hint="default"/>
-        <w:sz w:val="20"/>
-      </w:rPr>
     </w:lvl>
     <w:lvl w:ilvl="6" w:tentative="1">
       <w:start w:val="1"/>
-      <w:numFmt w:val="bullet"/>
-      <w:lvlText w:val=""/>
+      <w:numFmt w:val="decimal"/>
+      <w:lvlText w:val="%7."/>
       <w:lvlJc w:val="left"/>
       <w:pPr>
         <w:tabs>
@@ -24307,15 +22597,11 @@
         </w:tabs>
         <w:ind w:left="5040" w:hanging="360"/>
       </w:pPr>
-      <w:rPr>
-        <w:rFonts w:ascii="Wingdings" w:hAnsi="Wingdings" w:hint="default"/>
-        <w:sz w:val="20"/>
-      </w:rPr>
     </w:lvl>
     <w:lvl w:ilvl="7" w:tentative="1">
       <w:start w:val="1"/>
-      <w:numFmt w:val="bullet"/>
-      <w:lvlText w:val=""/>
+      <w:numFmt w:val="decimal"/>
+      <w:lvlText w:val="%8."/>
       <w:lvlJc w:val="left"/>
       <w:pPr>
         <w:tabs>
@@ -24323,15 +22609,11 @@
         </w:tabs>
         <w:ind w:left="5760" w:hanging="360"/>
       </w:pPr>
-      <w:rPr>
-        <w:rFonts w:ascii="Wingdings" w:hAnsi="Wingdings" w:hint="default"/>
-        <w:sz w:val="20"/>
-      </w:rPr>
     </w:lvl>
     <w:lvl w:ilvl="8" w:tentative="1">
       <w:start w:val="1"/>
-      <w:numFmt w:val="bullet"/>
-      <w:lvlText w:val=""/>
+      <w:numFmt w:val="decimal"/>
+      <w:lvlText w:val="%9."/>
       <w:lvlJc w:val="left"/>
       <w:pPr>
         <w:tabs>
@@ -24339,217 +22621,9 @@
         </w:tabs>
         <w:ind w:left="6480" w:hanging="360"/>
       </w:pPr>
-      <w:rPr>
-        <w:rFonts w:ascii="Wingdings" w:hAnsi="Wingdings" w:hint="default"/>
-        <w:sz w:val="20"/>
-      </w:rPr>
     </w:lvl>
   </w:abstractNum>
-  <w:abstractNum w:abstractNumId="47" w15:restartNumberingAfterBreak="0">
-    <w:nsid w:val="77B521CA"/>
-    <w:multiLevelType w:val="multilevel"/>
-    <w:tmpl w:val="E8D25FA6"/>
-    <w:lvl w:ilvl="0">
-      <w:start w:val="1"/>
-      <w:numFmt w:val="decimal"/>
-      <w:lvlText w:val="%1."/>
-      <w:lvlJc w:val="left"/>
-      <w:pPr>
-        <w:tabs>
-          <w:tab w:val="num" w:pos="720"/>
-        </w:tabs>
-        <w:ind w:left="720" w:hanging="360"/>
-      </w:pPr>
-    </w:lvl>
-    <w:lvl w:ilvl="1" w:tentative="1">
-      <w:start w:val="1"/>
-      <w:numFmt w:val="decimal"/>
-      <w:lvlText w:val="%2."/>
-      <w:lvlJc w:val="left"/>
-      <w:pPr>
-        <w:tabs>
-          <w:tab w:val="num" w:pos="1440"/>
-        </w:tabs>
-        <w:ind w:left="1440" w:hanging="360"/>
-      </w:pPr>
-    </w:lvl>
-    <w:lvl w:ilvl="2" w:tentative="1">
-      <w:start w:val="1"/>
-      <w:numFmt w:val="decimal"/>
-      <w:lvlText w:val="%3."/>
-      <w:lvlJc w:val="left"/>
-      <w:pPr>
-        <w:tabs>
-          <w:tab w:val="num" w:pos="2160"/>
-        </w:tabs>
-        <w:ind w:left="2160" w:hanging="360"/>
-      </w:pPr>
-    </w:lvl>
-    <w:lvl w:ilvl="3" w:tentative="1">
-      <w:start w:val="1"/>
-      <w:numFmt w:val="decimal"/>
-      <w:lvlText w:val="%4."/>
-      <w:lvlJc w:val="left"/>
-      <w:pPr>
-        <w:tabs>
-          <w:tab w:val="num" w:pos="2880"/>
-        </w:tabs>
-        <w:ind w:left="2880" w:hanging="360"/>
-      </w:pPr>
-    </w:lvl>
-    <w:lvl w:ilvl="4" w:tentative="1">
-      <w:start w:val="1"/>
-      <w:numFmt w:val="decimal"/>
-      <w:lvlText w:val="%5."/>
-      <w:lvlJc w:val="left"/>
-      <w:pPr>
-        <w:tabs>
-          <w:tab w:val="num" w:pos="3600"/>
-        </w:tabs>
-        <w:ind w:left="3600" w:hanging="360"/>
-      </w:pPr>
-    </w:lvl>
-    <w:lvl w:ilvl="5" w:tentative="1">
-      <w:start w:val="1"/>
-      <w:numFmt w:val="decimal"/>
-      <w:lvlText w:val="%6."/>
-      <w:lvlJc w:val="left"/>
-      <w:pPr>
-        <w:tabs>
-          <w:tab w:val="num" w:pos="4320"/>
-        </w:tabs>
-        <w:ind w:left="4320" w:hanging="360"/>
-      </w:pPr>
-    </w:lvl>
-    <w:lvl w:ilvl="6" w:tentative="1">
-      <w:start w:val="1"/>
-      <w:numFmt w:val="decimal"/>
-      <w:lvlText w:val="%7."/>
-      <w:lvlJc w:val="left"/>
-      <w:pPr>
-        <w:tabs>
-          <w:tab w:val="num" w:pos="5040"/>
-        </w:tabs>
-        <w:ind w:left="5040" w:hanging="360"/>
-      </w:pPr>
-    </w:lvl>
-    <w:lvl w:ilvl="7" w:tentative="1">
-      <w:start w:val="1"/>
-      <w:numFmt w:val="decimal"/>
-      <w:lvlText w:val="%8."/>
-      <w:lvlJc w:val="left"/>
-      <w:pPr>
-        <w:tabs>
-          <w:tab w:val="num" w:pos="5760"/>
-        </w:tabs>
-        <w:ind w:left="5760" w:hanging="360"/>
-      </w:pPr>
-    </w:lvl>
-    <w:lvl w:ilvl="8" w:tentative="1">
-      <w:start w:val="1"/>
-      <w:numFmt w:val="decimal"/>
-      <w:lvlText w:val="%9."/>
-      <w:lvlJc w:val="left"/>
-      <w:pPr>
-        <w:tabs>
-          <w:tab w:val="num" w:pos="6480"/>
-        </w:tabs>
-        <w:ind w:left="6480" w:hanging="360"/>
-      </w:pPr>
-    </w:lvl>
-  </w:abstractNum>
-  <w:abstractNum w:abstractNumId="48" w15:restartNumberingAfterBreak="0">
-    <w:nsid w:val="79DB26B6"/>
-    <w:multiLevelType w:val="hybridMultilevel"/>
-    <w:tmpl w:val="BA6AF24E"/>
-    <w:lvl w:ilvl="0" w:tplc="9F007270">
-      <w:start w:val="1"/>
-      <w:numFmt w:val="decimal"/>
-      <w:lvlText w:val="%1."/>
-      <w:lvlJc w:val="left"/>
-      <w:pPr>
-        <w:ind w:left="720" w:hanging="360"/>
-      </w:pPr>
-      <w:rPr>
-        <w:rFonts w:hint="default"/>
-        <w:color w:val="000000"/>
-        <w:sz w:val="26"/>
-      </w:rPr>
-    </w:lvl>
-    <w:lvl w:ilvl="1" w:tplc="04090019" w:tentative="1">
-      <w:start w:val="1"/>
-      <w:numFmt w:val="lowerLetter"/>
-      <w:lvlText w:val="%2."/>
-      <w:lvlJc w:val="left"/>
-      <w:pPr>
-        <w:ind w:left="1440" w:hanging="360"/>
-      </w:pPr>
-    </w:lvl>
-    <w:lvl w:ilvl="2" w:tplc="0409001B" w:tentative="1">
-      <w:start w:val="1"/>
-      <w:numFmt w:val="lowerRoman"/>
-      <w:lvlText w:val="%3."/>
-      <w:lvlJc w:val="right"/>
-      <w:pPr>
-        <w:ind w:left="2160" w:hanging="180"/>
-      </w:pPr>
-    </w:lvl>
-    <w:lvl w:ilvl="3" w:tplc="0409000F" w:tentative="1">
-      <w:start w:val="1"/>
-      <w:numFmt w:val="decimal"/>
-      <w:lvlText w:val="%4."/>
-      <w:lvlJc w:val="left"/>
-      <w:pPr>
-        <w:ind w:left="2880" w:hanging="360"/>
-      </w:pPr>
-    </w:lvl>
-    <w:lvl w:ilvl="4" w:tplc="04090019" w:tentative="1">
-      <w:start w:val="1"/>
-      <w:numFmt w:val="lowerLetter"/>
-      <w:lvlText w:val="%5."/>
-      <w:lvlJc w:val="left"/>
-      <w:pPr>
-        <w:ind w:left="3600" w:hanging="360"/>
-      </w:pPr>
-    </w:lvl>
-    <w:lvl w:ilvl="5" w:tplc="0409001B" w:tentative="1">
-      <w:start w:val="1"/>
-      <w:numFmt w:val="lowerRoman"/>
-      <w:lvlText w:val="%6."/>
-      <w:lvlJc w:val="right"/>
-      <w:pPr>
-        <w:ind w:left="4320" w:hanging="180"/>
-      </w:pPr>
-    </w:lvl>
-    <w:lvl w:ilvl="6" w:tplc="0409000F" w:tentative="1">
-      <w:start w:val="1"/>
-      <w:numFmt w:val="decimal"/>
-      <w:lvlText w:val="%7."/>
-      <w:lvlJc w:val="left"/>
-      <w:pPr>
-        <w:ind w:left="5040" w:hanging="360"/>
-      </w:pPr>
-    </w:lvl>
-    <w:lvl w:ilvl="7" w:tplc="04090019" w:tentative="1">
-      <w:start w:val="1"/>
-      <w:numFmt w:val="lowerLetter"/>
-      <w:lvlText w:val="%8."/>
-      <w:lvlJc w:val="left"/>
-      <w:pPr>
-        <w:ind w:left="5760" w:hanging="360"/>
-      </w:pPr>
-    </w:lvl>
-    <w:lvl w:ilvl="8" w:tplc="0409001B" w:tentative="1">
-      <w:start w:val="1"/>
-      <w:numFmt w:val="lowerRoman"/>
-      <w:lvlText w:val="%9."/>
-      <w:lvlJc w:val="right"/>
-      <w:pPr>
-        <w:ind w:left="6480" w:hanging="180"/>
-      </w:pPr>
-    </w:lvl>
-  </w:abstractNum>
-  <w:abstractNum w:abstractNumId="49" w15:restartNumberingAfterBreak="0">
+  <w:abstractNum w:abstractNumId="32" w15:restartNumberingAfterBreak="0">
     <w:nsid w:val="7D241863"/>
     <w:multiLevelType w:val="multilevel"/>
     <w:tmpl w:val="6A3AA0FA"/>
@@ -24698,161 +22772,108 @@
     </w:lvl>
   </w:abstractNum>
   <w:num w:numId="1">
-    <w:abstractNumId w:val="0"/>
+    <w:abstractNumId w:val="25"/>
     <w:lvlOverride w:ilvl="0">
       <w:startOverride w:val="1"/>
     </w:lvlOverride>
   </w:num>
   <w:num w:numId="2">
-    <w:abstractNumId w:val="38"/>
-    <w:lvlOverride w:ilvl="0">
-      <w:startOverride w:val="1"/>
-    </w:lvlOverride>
+    <w:abstractNumId w:val="31"/>
   </w:num>
   <w:num w:numId="3">
-    <w:abstractNumId w:val="34"/>
+    <w:abstractNumId w:val="2"/>
   </w:num>
   <w:num w:numId="4">
-    <w:abstractNumId w:val="35"/>
+    <w:abstractNumId w:val="32"/>
   </w:num>
   <w:num w:numId="5">
-    <w:abstractNumId w:val="46"/>
+    <w:abstractNumId w:val="22"/>
   </w:num>
   <w:num w:numId="6">
-    <w:abstractNumId w:val="36"/>
+    <w:abstractNumId w:val="17"/>
   </w:num>
   <w:num w:numId="7">
-    <w:abstractNumId w:val="18"/>
+    <w:abstractNumId w:val="13"/>
   </w:num>
   <w:num w:numId="8">
-    <w:abstractNumId w:val="39"/>
+    <w:abstractNumId w:val="11"/>
   </w:num>
   <w:num w:numId="9">
-    <w:abstractNumId w:val="47"/>
+    <w:abstractNumId w:val="6"/>
   </w:num>
   <w:num w:numId="10">
-    <w:abstractNumId w:val="3"/>
+    <w:abstractNumId w:val="20"/>
   </w:num>
   <w:num w:numId="11">
-    <w:abstractNumId w:val="49"/>
+    <w:abstractNumId w:val="9"/>
   </w:num>
   <w:num w:numId="12">
-    <w:abstractNumId w:val="33"/>
+    <w:abstractNumId w:val="7"/>
   </w:num>
   <w:num w:numId="13">
-    <w:abstractNumId w:val="8"/>
+    <w:abstractNumId w:val="14"/>
   </w:num>
   <w:num w:numId="14">
-    <w:abstractNumId w:val="28"/>
+    <w:abstractNumId w:val="27"/>
   </w:num>
   <w:num w:numId="15">
-    <w:abstractNumId w:val="22"/>
+    <w:abstractNumId w:val="26"/>
   </w:num>
   <w:num w:numId="16">
     <w:abstractNumId w:val="19"/>
   </w:num>
   <w:num w:numId="17">
+    <w:abstractNumId w:val="29"/>
+  </w:num>
+  <w:num w:numId="18">
     <w:abstractNumId w:val="10"/>
   </w:num>
-  <w:num w:numId="18">
-    <w:abstractNumId w:val="17"/>
-  </w:num>
   <w:num w:numId="19">
-    <w:abstractNumId w:val="48"/>
+    <w:abstractNumId w:val="21"/>
   </w:num>
   <w:num w:numId="20">
-    <w:abstractNumId w:val="27"/>
+    <w:abstractNumId w:val="15"/>
   </w:num>
   <w:num w:numId="21">
+    <w:abstractNumId w:val="16"/>
+  </w:num>
+  <w:num w:numId="22">
+    <w:abstractNumId w:val="3"/>
+  </w:num>
+  <w:num w:numId="23">
+    <w:abstractNumId w:val="0"/>
+  </w:num>
+  <w:num w:numId="24">
+    <w:abstractNumId w:val="1"/>
+  </w:num>
+  <w:num w:numId="25">
+    <w:abstractNumId w:val="12"/>
+  </w:num>
+  <w:num w:numId="26">
+    <w:abstractNumId w:val="5"/>
+  </w:num>
+  <w:num w:numId="27">
+    <w:abstractNumId w:val="18"/>
+  </w:num>
+  <w:num w:numId="28">
+    <w:abstractNumId w:val="28"/>
+  </w:num>
+  <w:num w:numId="29">
     <w:abstractNumId w:val="24"/>
   </w:num>
-  <w:num w:numId="22">
-    <w:abstractNumId w:val="41"/>
+  <w:num w:numId="30">
+    <w:abstractNumId w:val="30"/>
   </w:num>
-  <w:num w:numId="23">
-    <w:abstractNumId w:val="5"/>
+  <w:num w:numId="31">
+    <w:abstractNumId w:val="4"/>
   </w:num>
-  <w:num w:numId="24">
-    <w:abstractNumId w:val="11"/>
+  <w:num w:numId="32">
+    <w:abstractNumId w:val="8"/>
   </w:num>
-  <w:num w:numId="25">
-    <w:abstractNumId w:val="9"/>
-  </w:num>
-  <w:num w:numId="26">
-    <w:abstractNumId w:val="21"/>
-  </w:num>
-  <w:num w:numId="27">
-    <w:abstractNumId w:val="31"/>
-  </w:num>
-  <w:num w:numId="28">
-    <w:abstractNumId w:val="15"/>
-  </w:num>
-  <w:num w:numId="29">
-    <w:abstractNumId w:val="12"/>
-  </w:num>
-  <w:num w:numId="30">
+  <w:num w:numId="33">
     <w:abstractNumId w:val="23"/>
   </w:num>
-  <w:num w:numId="31">
-    <w:abstractNumId w:val="42"/>
-  </w:num>
-  <w:num w:numId="32">
-    <w:abstractNumId w:val="40"/>
-  </w:num>
-  <w:num w:numId="33">
-    <w:abstractNumId w:val="30"/>
-  </w:num>
-  <w:num w:numId="34">
-    <w:abstractNumId w:val="44"/>
-  </w:num>
-  <w:num w:numId="35">
-    <w:abstractNumId w:val="16"/>
-  </w:num>
-  <w:num w:numId="36">
-    <w:abstractNumId w:val="32"/>
-  </w:num>
-  <w:num w:numId="37">
-    <w:abstractNumId w:val="25"/>
-  </w:num>
-  <w:num w:numId="38">
-    <w:abstractNumId w:val="26"/>
-  </w:num>
-  <w:num w:numId="39">
-    <w:abstractNumId w:val="4"/>
-  </w:num>
-  <w:num w:numId="40">
-    <w:abstractNumId w:val="1"/>
-  </w:num>
-  <w:num w:numId="41">
-    <w:abstractNumId w:val="14"/>
-  </w:num>
-  <w:num w:numId="42">
-    <w:abstractNumId w:val="2"/>
-  </w:num>
-  <w:num w:numId="43">
-    <w:abstractNumId w:val="20"/>
-  </w:num>
-  <w:num w:numId="44">
-    <w:abstractNumId w:val="7"/>
-  </w:num>
-  <w:num w:numId="45">
-    <w:abstractNumId w:val="29"/>
-  </w:num>
-  <w:num w:numId="46">
-    <w:abstractNumId w:val="43"/>
-  </w:num>
-  <w:num w:numId="47">
-    <w:abstractNumId w:val="37"/>
-  </w:num>
-  <w:num w:numId="48">
-    <w:abstractNumId w:val="45"/>
-  </w:num>
-  <w:num w:numId="49">
-    <w:abstractNumId w:val="6"/>
-  </w:num>
-  <w:num w:numId="50">
-    <w:abstractNumId w:val="13"/>
-  </w:num>
+  <w:numIdMacAtCleanup w:val="33"/>
 </w:numbering>
 </file>
 

</xml_diff>